<commit_message>
docs(cap3): agregué modelo de dominio, glosario de términos y casos de uso - fase 2
</commit_message>
<xml_diff>
--- a/capitulos/cap3_analisis_requisitos.docx
+++ b/capitulos/cap3_analisis_requisitos.docx
@@ -36,13 +36,7 @@
       </w:r>
       <w:proofErr w:type="spellEnd"/>
       <w:r>
-        <w:t xml:space="preserve"> Travel son todas las personas o entidades que participan directa o indirectamente en el funcionamiento del sistema. A </w:t>
-      </w:r>
-      <w:r>
-        <w:t>continuación,</w:t>
-      </w:r>
-      <w:r>
-        <w:t xml:space="preserve"> se detallan en la Tabla 1.</w:t>
+        <w:t xml:space="preserve"> Travel son todas las personas o entidades que participan directa o indirectamente en el funcionamiento del sistema. A continuación, se detallan en la Tabla 1.</w:t>
       </w:r>
     </w:p>
     <w:p/>
@@ -630,6 +624,7 @@
               <w:ind w:firstLine="0"/>
             </w:pPr>
             <w:r>
+              <w:lastRenderedPageBreak/>
               <w:t>RF04</w:t>
             </w:r>
           </w:p>
@@ -705,11 +700,7 @@
               <w:cnfStyle w:val="000000100000" w:firstRow="0" w:lastRow="0" w:firstColumn="0" w:lastColumn="0" w:oddVBand="0" w:evenVBand="0" w:oddHBand="1" w:evenHBand="0" w:firstRowFirstColumn="0" w:firstRowLastColumn="0" w:lastRowFirstColumn="0" w:lastRowLastColumn="0"/>
             </w:pPr>
             <w:r>
-              <w:t xml:space="preserve">El sistema permite filtrar paquetes por destino, </w:t>
-            </w:r>
-            <w:r>
-              <w:lastRenderedPageBreak/>
-              <w:t>precio y disponibilidad</w:t>
+              <w:t>El sistema permite filtrar paquetes por destino, precio y disponibilidad</w:t>
             </w:r>
           </w:p>
         </w:tc>
@@ -725,7 +716,6 @@
               <w:ind w:firstLine="0"/>
             </w:pPr>
             <w:r>
-              <w:lastRenderedPageBreak/>
               <w:t>RF06</w:t>
             </w:r>
           </w:p>
@@ -1363,6 +1353,7 @@
               <w:ind w:firstLine="0"/>
             </w:pPr>
             <w:r>
+              <w:lastRenderedPageBreak/>
               <w:t>RF20</w:t>
             </w:r>
           </w:p>
@@ -1937,7 +1928,11 @@
       </w:r>
       <w:proofErr w:type="spellEnd"/>
       <w:r>
-        <w:t xml:space="preserve"> Travel. Cada historia cuenta con su prioridad, estimación en puntos de historia y sprint asignado. El detalle completo de cada historia, incluyendo criterios de aceptación, se encuentra en el Anexo B del presente informe. </w:t>
+        <w:t xml:space="preserve"> Travel. Cada historia cuenta con su prioridad, estimación en puntos </w:t>
+      </w:r>
+      <w:r>
+        <w:lastRenderedPageBreak/>
+        <w:t xml:space="preserve">de historia y sprint asignado. El detalle completo de cada historia, incluyendo criterios de aceptación, se encuentra en el Anexo B del presente informe. </w:t>
       </w:r>
     </w:p>
     <w:p>
@@ -2468,7 +2463,6 @@
               <w:ind w:firstLine="0"/>
             </w:pPr>
             <w:r>
-              <w:lastRenderedPageBreak/>
               <w:t>HU-06</w:t>
             </w:r>
           </w:p>
@@ -3573,6 +3567,2684 @@
       </w:r>
     </w:p>
     <w:p/>
+    <w:p>
+      <w:pPr>
+        <w:pStyle w:val="Ttulo2"/>
+      </w:pPr>
+      <w:r>
+        <w:lastRenderedPageBreak/>
+        <w:t>3.5. Modelo del Dominio</w:t>
+      </w:r>
+    </w:p>
+    <w:p>
+      <w:r>
+        <w:t xml:space="preserve">El modelo del dominio del sistema </w:t>
+      </w:r>
+      <w:proofErr w:type="spellStart"/>
+      <w:r>
+        <w:t>Kuelap</w:t>
+      </w:r>
+      <w:proofErr w:type="spellEnd"/>
+      <w:r>
+        <w:t xml:space="preserve"> Travel identifica las entidades principales y sus relaciones.</w:t>
+      </w:r>
+    </w:p>
+    <w:p>
+      <w:pPr>
+        <w:rPr>
+          <w:b/>
+          <w:bCs/>
+        </w:rPr>
+      </w:pPr>
+      <w:r>
+        <w:rPr>
+          <w:b/>
+          <w:bCs/>
+        </w:rPr>
+        <w:t>Tabla 5.</w:t>
+      </w:r>
+    </w:p>
+    <w:p>
+      <w:pPr>
+        <w:rPr>
+          <w:i/>
+          <w:iCs/>
+        </w:rPr>
+      </w:pPr>
+      <w:r>
+        <w:rPr>
+          <w:i/>
+          <w:iCs/>
+        </w:rPr>
+        <w:t xml:space="preserve">Entidades del modelo del dominio – Sistema </w:t>
+      </w:r>
+      <w:proofErr w:type="spellStart"/>
+      <w:r>
+        <w:rPr>
+          <w:i/>
+          <w:iCs/>
+        </w:rPr>
+        <w:t>Kuelap</w:t>
+      </w:r>
+      <w:proofErr w:type="spellEnd"/>
+      <w:r>
+        <w:rPr>
+          <w:i/>
+          <w:iCs/>
+        </w:rPr>
+        <w:t xml:space="preserve"> Travel</w:t>
+      </w:r>
+    </w:p>
+    <w:tbl>
+      <w:tblPr>
+        <w:tblStyle w:val="Tablanormal2"/>
+        <w:tblW w:w="0" w:type="auto"/>
+        <w:tblLook w:val="04A0" w:firstRow="1" w:lastRow="0" w:firstColumn="1" w:lastColumn="0" w:noHBand="0" w:noVBand="1"/>
+      </w:tblPr>
+      <w:tblGrid>
+        <w:gridCol w:w="2831"/>
+        <w:gridCol w:w="2831"/>
+        <w:gridCol w:w="2832"/>
+      </w:tblGrid>
+      <w:tr>
+        <w:trPr>
+          <w:cnfStyle w:val="100000000000" w:firstRow="1" w:lastRow="0" w:firstColumn="0" w:lastColumn="0" w:oddVBand="0" w:evenVBand="0" w:oddHBand="0" w:evenHBand="0" w:firstRowFirstColumn="0" w:firstRowLastColumn="0" w:lastRowFirstColumn="0" w:lastRowLastColumn="0"/>
+        </w:trPr>
+        <w:tc>
+          <w:tcPr>
+            <w:cnfStyle w:val="001000000000" w:firstRow="0" w:lastRow="0" w:firstColumn="1" w:lastColumn="0" w:oddVBand="0" w:evenVBand="0" w:oddHBand="0" w:evenHBand="0" w:firstRowFirstColumn="0" w:firstRowLastColumn="0" w:lastRowFirstColumn="0" w:lastRowLastColumn="0"/>
+            <w:tcW w:w="2831" w:type="dxa"/>
+          </w:tcPr>
+          <w:p>
+            <w:pPr>
+              <w:ind w:firstLine="0"/>
+            </w:pPr>
+            <w:r>
+              <w:t>Entidad</w:t>
+            </w:r>
+          </w:p>
+        </w:tc>
+        <w:tc>
+          <w:tcPr>
+            <w:tcW w:w="2831" w:type="dxa"/>
+          </w:tcPr>
+          <w:p>
+            <w:pPr>
+              <w:ind w:firstLine="0"/>
+              <w:cnfStyle w:val="100000000000" w:firstRow="1" w:lastRow="0" w:firstColumn="0" w:lastColumn="0" w:oddVBand="0" w:evenVBand="0" w:oddHBand="0" w:evenHBand="0" w:firstRowFirstColumn="0" w:firstRowLastColumn="0" w:lastRowFirstColumn="0" w:lastRowLastColumn="0"/>
+            </w:pPr>
+            <w:r>
+              <w:t>Descripción</w:t>
+            </w:r>
+          </w:p>
+        </w:tc>
+        <w:tc>
+          <w:tcPr>
+            <w:tcW w:w="2832" w:type="dxa"/>
+          </w:tcPr>
+          <w:p>
+            <w:pPr>
+              <w:ind w:firstLine="0"/>
+              <w:cnfStyle w:val="100000000000" w:firstRow="1" w:lastRow="0" w:firstColumn="0" w:lastColumn="0" w:oddVBand="0" w:evenVBand="0" w:oddHBand="0" w:evenHBand="0" w:firstRowFirstColumn="0" w:firstRowLastColumn="0" w:lastRowFirstColumn="0" w:lastRowLastColumn="0"/>
+            </w:pPr>
+            <w:r>
+              <w:t>Atributos principales</w:t>
+            </w:r>
+          </w:p>
+        </w:tc>
+      </w:tr>
+      <w:tr>
+        <w:trPr>
+          <w:cnfStyle w:val="000000100000" w:firstRow="0" w:lastRow="0" w:firstColumn="0" w:lastColumn="0" w:oddVBand="0" w:evenVBand="0" w:oddHBand="1" w:evenHBand="0" w:firstRowFirstColumn="0" w:firstRowLastColumn="0" w:lastRowFirstColumn="0" w:lastRowLastColumn="0"/>
+        </w:trPr>
+        <w:tc>
+          <w:tcPr>
+            <w:cnfStyle w:val="001000000000" w:firstRow="0" w:lastRow="0" w:firstColumn="1" w:lastColumn="0" w:oddVBand="0" w:evenVBand="0" w:oddHBand="0" w:evenHBand="0" w:firstRowFirstColumn="0" w:firstRowLastColumn="0" w:lastRowFirstColumn="0" w:lastRowLastColumn="0"/>
+            <w:tcW w:w="2831" w:type="dxa"/>
+          </w:tcPr>
+          <w:p>
+            <w:pPr>
+              <w:ind w:firstLine="0"/>
+            </w:pPr>
+            <w:r>
+              <w:t>Turista</w:t>
+            </w:r>
+          </w:p>
+        </w:tc>
+        <w:tc>
+          <w:tcPr>
+            <w:tcW w:w="2831" w:type="dxa"/>
+          </w:tcPr>
+          <w:p>
+            <w:pPr>
+              <w:ind w:firstLine="0"/>
+              <w:cnfStyle w:val="000000100000" w:firstRow="0" w:lastRow="0" w:firstColumn="0" w:lastColumn="0" w:oddVBand="0" w:evenVBand="0" w:oddHBand="1" w:evenHBand="0" w:firstRowFirstColumn="0" w:firstRowLastColumn="0" w:lastRowFirstColumn="0" w:lastRowLastColumn="0"/>
+            </w:pPr>
+            <w:r>
+              <w:t>Usuario que busca, reserva y paga paquetes turísticos</w:t>
+            </w:r>
+          </w:p>
+        </w:tc>
+        <w:tc>
+          <w:tcPr>
+            <w:tcW w:w="2832" w:type="dxa"/>
+          </w:tcPr>
+          <w:p>
+            <w:pPr>
+              <w:ind w:firstLine="0"/>
+              <w:cnfStyle w:val="000000100000" w:firstRow="0" w:lastRow="0" w:firstColumn="0" w:lastColumn="0" w:oddVBand="0" w:evenVBand="0" w:oddHBand="1" w:evenHBand="0" w:firstRowFirstColumn="0" w:firstRowLastColumn="0" w:lastRowFirstColumn="0" w:lastRowLastColumn="0"/>
+            </w:pPr>
+            <w:r>
+              <w:t>ID, nombre, correo, contraseña, teléfono, dirección</w:t>
+            </w:r>
+          </w:p>
+        </w:tc>
+      </w:tr>
+      <w:tr>
+        <w:tc>
+          <w:tcPr>
+            <w:cnfStyle w:val="001000000000" w:firstRow="0" w:lastRow="0" w:firstColumn="1" w:lastColumn="0" w:oddVBand="0" w:evenVBand="0" w:oddHBand="0" w:evenHBand="0" w:firstRowFirstColumn="0" w:firstRowLastColumn="0" w:lastRowFirstColumn="0" w:lastRowLastColumn="0"/>
+            <w:tcW w:w="2831" w:type="dxa"/>
+          </w:tcPr>
+          <w:p>
+            <w:pPr>
+              <w:ind w:firstLine="0"/>
+            </w:pPr>
+            <w:r>
+              <w:t>Administrador</w:t>
+            </w:r>
+          </w:p>
+        </w:tc>
+        <w:tc>
+          <w:tcPr>
+            <w:tcW w:w="2831" w:type="dxa"/>
+          </w:tcPr>
+          <w:p>
+            <w:pPr>
+              <w:ind w:firstLine="0"/>
+              <w:cnfStyle w:val="000000000000" w:firstRow="0" w:lastRow="0" w:firstColumn="0" w:lastColumn="0" w:oddVBand="0" w:evenVBand="0" w:oddHBand="0" w:evenHBand="0" w:firstRowFirstColumn="0" w:firstRowLastColumn="0" w:lastRowFirstColumn="0" w:lastRowLastColumn="0"/>
+            </w:pPr>
+            <w:r>
+              <w:t>Gestor del catálogo de paquetes y reservas</w:t>
+            </w:r>
+          </w:p>
+        </w:tc>
+        <w:tc>
+          <w:tcPr>
+            <w:tcW w:w="2832" w:type="dxa"/>
+          </w:tcPr>
+          <w:p>
+            <w:pPr>
+              <w:ind w:firstLine="0"/>
+              <w:cnfStyle w:val="000000000000" w:firstRow="0" w:lastRow="0" w:firstColumn="0" w:lastColumn="0" w:oddVBand="0" w:evenVBand="0" w:oddHBand="0" w:evenHBand="0" w:firstRowFirstColumn="0" w:firstRowLastColumn="0" w:lastRowFirstColumn="0" w:lastRowLastColumn="0"/>
+            </w:pPr>
+            <w:r>
+              <w:t>ID, nombre, usuario, contraseña, rol</w:t>
+            </w:r>
+          </w:p>
+        </w:tc>
+      </w:tr>
+      <w:tr>
+        <w:trPr>
+          <w:cnfStyle w:val="000000100000" w:firstRow="0" w:lastRow="0" w:firstColumn="0" w:lastColumn="0" w:oddVBand="0" w:evenVBand="0" w:oddHBand="1" w:evenHBand="0" w:firstRowFirstColumn="0" w:firstRowLastColumn="0" w:lastRowFirstColumn="0" w:lastRowLastColumn="0"/>
+        </w:trPr>
+        <w:tc>
+          <w:tcPr>
+            <w:cnfStyle w:val="001000000000" w:firstRow="0" w:lastRow="0" w:firstColumn="1" w:lastColumn="0" w:oddVBand="0" w:evenVBand="0" w:oddHBand="0" w:evenHBand="0" w:firstRowFirstColumn="0" w:firstRowLastColumn="0" w:lastRowFirstColumn="0" w:lastRowLastColumn="0"/>
+            <w:tcW w:w="2831" w:type="dxa"/>
+          </w:tcPr>
+          <w:p>
+            <w:pPr>
+              <w:ind w:firstLine="0"/>
+            </w:pPr>
+            <w:r>
+              <w:t>Agencia de viajes</w:t>
+            </w:r>
+          </w:p>
+        </w:tc>
+        <w:tc>
+          <w:tcPr>
+            <w:tcW w:w="2831" w:type="dxa"/>
+          </w:tcPr>
+          <w:p>
+            <w:pPr>
+              <w:ind w:firstLine="0"/>
+              <w:cnfStyle w:val="000000100000" w:firstRow="0" w:lastRow="0" w:firstColumn="0" w:lastColumn="0" w:oddVBand="0" w:evenVBand="0" w:oddHBand="1" w:evenHBand="0" w:firstRowFirstColumn="0" w:firstRowLastColumn="0" w:lastRowFirstColumn="0" w:lastRowLastColumn="0"/>
+            </w:pPr>
+            <w:r>
+              <w:t>Operador que ofrece paquetes turísticos</w:t>
+            </w:r>
+          </w:p>
+        </w:tc>
+        <w:tc>
+          <w:tcPr>
+            <w:tcW w:w="2832" w:type="dxa"/>
+          </w:tcPr>
+          <w:p>
+            <w:pPr>
+              <w:ind w:firstLine="0"/>
+              <w:cnfStyle w:val="000000100000" w:firstRow="0" w:lastRow="0" w:firstColumn="0" w:lastColumn="0" w:oddVBand="0" w:evenVBand="0" w:oddHBand="1" w:evenHBand="0" w:firstRowFirstColumn="0" w:firstRowLastColumn="0" w:lastRowFirstColumn="0" w:lastRowLastColumn="0"/>
+            </w:pPr>
+            <w:r>
+              <w:t>ID, nombre, RUC, contacto, descripción</w:t>
+            </w:r>
+          </w:p>
+        </w:tc>
+      </w:tr>
+      <w:tr>
+        <w:tc>
+          <w:tcPr>
+            <w:cnfStyle w:val="001000000000" w:firstRow="0" w:lastRow="0" w:firstColumn="1" w:lastColumn="0" w:oddVBand="0" w:evenVBand="0" w:oddHBand="0" w:evenHBand="0" w:firstRowFirstColumn="0" w:firstRowLastColumn="0" w:lastRowFirstColumn="0" w:lastRowLastColumn="0"/>
+            <w:tcW w:w="2831" w:type="dxa"/>
+          </w:tcPr>
+          <w:p>
+            <w:pPr>
+              <w:ind w:firstLine="0"/>
+            </w:pPr>
+            <w:r>
+              <w:t>Paquete turístico</w:t>
+            </w:r>
+          </w:p>
+        </w:tc>
+        <w:tc>
+          <w:tcPr>
+            <w:tcW w:w="2831" w:type="dxa"/>
+          </w:tcPr>
+          <w:p>
+            <w:pPr>
+              <w:ind w:firstLine="0"/>
+              <w:cnfStyle w:val="000000000000" w:firstRow="0" w:lastRow="0" w:firstColumn="0" w:lastColumn="0" w:oddVBand="0" w:evenVBand="0" w:oddHBand="0" w:evenHBand="0" w:firstRowFirstColumn="0" w:firstRowLastColumn="0" w:lastRowFirstColumn="0" w:lastRowLastColumn="0"/>
+            </w:pPr>
+            <w:r>
+              <w:t>Oferta de viaje a un destino específico</w:t>
+            </w:r>
+          </w:p>
+        </w:tc>
+        <w:tc>
+          <w:tcPr>
+            <w:tcW w:w="2832" w:type="dxa"/>
+          </w:tcPr>
+          <w:p>
+            <w:pPr>
+              <w:ind w:firstLine="0"/>
+              <w:cnfStyle w:val="000000000000" w:firstRow="0" w:lastRow="0" w:firstColumn="0" w:lastColumn="0" w:oddVBand="0" w:evenVBand="0" w:oddHBand="0" w:evenHBand="0" w:firstRowFirstColumn="0" w:firstRowLastColumn="0" w:lastRowFirstColumn="0" w:lastRowLastColumn="0"/>
+            </w:pPr>
+            <w:r>
+              <w:t>ID, nombre, destino, precio, itinerario, disponibilidad, fotos</w:t>
+            </w:r>
+          </w:p>
+        </w:tc>
+      </w:tr>
+      <w:tr>
+        <w:trPr>
+          <w:cnfStyle w:val="000000100000" w:firstRow="0" w:lastRow="0" w:firstColumn="0" w:lastColumn="0" w:oddVBand="0" w:evenVBand="0" w:oddHBand="1" w:evenHBand="0" w:firstRowFirstColumn="0" w:firstRowLastColumn="0" w:lastRowFirstColumn="0" w:lastRowLastColumn="0"/>
+        </w:trPr>
+        <w:tc>
+          <w:tcPr>
+            <w:cnfStyle w:val="001000000000" w:firstRow="0" w:lastRow="0" w:firstColumn="1" w:lastColumn="0" w:oddVBand="0" w:evenVBand="0" w:oddHBand="0" w:evenHBand="0" w:firstRowFirstColumn="0" w:firstRowLastColumn="0" w:lastRowFirstColumn="0" w:lastRowLastColumn="0"/>
+            <w:tcW w:w="2831" w:type="dxa"/>
+          </w:tcPr>
+          <w:p>
+            <w:pPr>
+              <w:ind w:firstLine="0"/>
+            </w:pPr>
+            <w:r>
+              <w:t>Reserva</w:t>
+            </w:r>
+          </w:p>
+        </w:tc>
+        <w:tc>
+          <w:tcPr>
+            <w:tcW w:w="2831" w:type="dxa"/>
+          </w:tcPr>
+          <w:p>
+            <w:pPr>
+              <w:ind w:firstLine="0"/>
+              <w:cnfStyle w:val="000000100000" w:firstRow="0" w:lastRow="0" w:firstColumn="0" w:lastColumn="0" w:oddVBand="0" w:evenVBand="0" w:oddHBand="1" w:evenHBand="0" w:firstRowFirstColumn="0" w:firstRowLastColumn="0" w:lastRowFirstColumn="0" w:lastRowLastColumn="0"/>
+            </w:pPr>
+            <w:r>
+              <w:t>Registro de la intención de compra del turista</w:t>
+            </w:r>
+          </w:p>
+        </w:tc>
+        <w:tc>
+          <w:tcPr>
+            <w:tcW w:w="2832" w:type="dxa"/>
+          </w:tcPr>
+          <w:p>
+            <w:pPr>
+              <w:ind w:firstLine="0"/>
+              <w:cnfStyle w:val="000000100000" w:firstRow="0" w:lastRow="0" w:firstColumn="0" w:lastColumn="0" w:oddVBand="0" w:evenVBand="0" w:oddHBand="1" w:evenHBand="0" w:firstRowFirstColumn="0" w:firstRowLastColumn="0" w:lastRowFirstColumn="0" w:lastRowLastColumn="0"/>
+            </w:pPr>
+            <w:r>
+              <w:t xml:space="preserve">ID, turista, paquete, </w:t>
+            </w:r>
+            <w:proofErr w:type="spellStart"/>
+            <w:r>
+              <w:t>fecha_reserva</w:t>
+            </w:r>
+            <w:proofErr w:type="spellEnd"/>
+            <w:r>
+              <w:t xml:space="preserve">, estado, </w:t>
+            </w:r>
+            <w:proofErr w:type="spellStart"/>
+            <w:r>
+              <w:t>cantidad_personas</w:t>
+            </w:r>
+            <w:proofErr w:type="spellEnd"/>
+          </w:p>
+        </w:tc>
+      </w:tr>
+      <w:tr>
+        <w:tc>
+          <w:tcPr>
+            <w:cnfStyle w:val="001000000000" w:firstRow="0" w:lastRow="0" w:firstColumn="1" w:lastColumn="0" w:oddVBand="0" w:evenVBand="0" w:oddHBand="0" w:evenHBand="0" w:firstRowFirstColumn="0" w:firstRowLastColumn="0" w:lastRowFirstColumn="0" w:lastRowLastColumn="0"/>
+            <w:tcW w:w="2831" w:type="dxa"/>
+          </w:tcPr>
+          <w:p>
+            <w:pPr>
+              <w:ind w:firstLine="0"/>
+            </w:pPr>
+            <w:r>
+              <w:t>Pago</w:t>
+            </w:r>
+          </w:p>
+        </w:tc>
+        <w:tc>
+          <w:tcPr>
+            <w:tcW w:w="2831" w:type="dxa"/>
+          </w:tcPr>
+          <w:p>
+            <w:pPr>
+              <w:ind w:firstLine="0"/>
+              <w:cnfStyle w:val="000000000000" w:firstRow="0" w:lastRow="0" w:firstColumn="0" w:lastColumn="0" w:oddVBand="0" w:evenVBand="0" w:oddHBand="0" w:evenHBand="0" w:firstRowFirstColumn="0" w:firstRowLastColumn="0" w:lastRowFirstColumn="0" w:lastRowLastColumn="0"/>
+            </w:pPr>
+            <w:r>
+              <w:t>Transacción económica asociada a una reserva</w:t>
+            </w:r>
+          </w:p>
+        </w:tc>
+        <w:tc>
+          <w:tcPr>
+            <w:tcW w:w="2832" w:type="dxa"/>
+          </w:tcPr>
+          <w:p>
+            <w:pPr>
+              <w:ind w:firstLine="0"/>
+              <w:cnfStyle w:val="000000000000" w:firstRow="0" w:lastRow="0" w:firstColumn="0" w:lastColumn="0" w:oddVBand="0" w:evenVBand="0" w:oddHBand="0" w:evenHBand="0" w:firstRowFirstColumn="0" w:firstRowLastColumn="0" w:lastRowFirstColumn="0" w:lastRowLastColumn="0"/>
+            </w:pPr>
+            <w:r>
+              <w:t>ID, reserva, monto, fecha, método, estado, referencia</w:t>
+            </w:r>
+          </w:p>
+        </w:tc>
+      </w:tr>
+      <w:tr>
+        <w:trPr>
+          <w:cnfStyle w:val="000000100000" w:firstRow="0" w:lastRow="0" w:firstColumn="0" w:lastColumn="0" w:oddVBand="0" w:evenVBand="0" w:oddHBand="1" w:evenHBand="0" w:firstRowFirstColumn="0" w:firstRowLastColumn="0" w:lastRowFirstColumn="0" w:lastRowLastColumn="0"/>
+        </w:trPr>
+        <w:tc>
+          <w:tcPr>
+            <w:cnfStyle w:val="001000000000" w:firstRow="0" w:lastRow="0" w:firstColumn="1" w:lastColumn="0" w:oddVBand="0" w:evenVBand="0" w:oddHBand="0" w:evenHBand="0" w:firstRowFirstColumn="0" w:firstRowLastColumn="0" w:lastRowFirstColumn="0" w:lastRowLastColumn="0"/>
+            <w:tcW w:w="2831" w:type="dxa"/>
+          </w:tcPr>
+          <w:p>
+            <w:pPr>
+              <w:ind w:firstLine="0"/>
+            </w:pPr>
+            <w:r>
+              <w:t>Comprobante</w:t>
+            </w:r>
+          </w:p>
+        </w:tc>
+        <w:tc>
+          <w:tcPr>
+            <w:tcW w:w="2831" w:type="dxa"/>
+          </w:tcPr>
+          <w:p>
+            <w:pPr>
+              <w:ind w:firstLine="0"/>
+              <w:cnfStyle w:val="000000100000" w:firstRow="0" w:lastRow="0" w:firstColumn="0" w:lastColumn="0" w:oddVBand="0" w:evenVBand="0" w:oddHBand="1" w:evenHBand="0" w:firstRowFirstColumn="0" w:firstRowLastColumn="0" w:lastRowFirstColumn="0" w:lastRowLastColumn="0"/>
+            </w:pPr>
+            <w:r>
+              <w:t>Documento digital de la transacción realizada</w:t>
+            </w:r>
+          </w:p>
+        </w:tc>
+        <w:tc>
+          <w:tcPr>
+            <w:tcW w:w="2832" w:type="dxa"/>
+          </w:tcPr>
+          <w:p>
+            <w:pPr>
+              <w:ind w:firstLine="0"/>
+              <w:cnfStyle w:val="000000100000" w:firstRow="0" w:lastRow="0" w:firstColumn="0" w:lastColumn="0" w:oddVBand="0" w:evenVBand="0" w:oddHBand="1" w:evenHBand="0" w:firstRowFirstColumn="0" w:firstRowLastColumn="0" w:lastRowFirstColumn="0" w:lastRowLastColumn="0"/>
+            </w:pPr>
+            <w:r>
+              <w:t xml:space="preserve">ID, pago, número, fecha, </w:t>
+            </w:r>
+            <w:proofErr w:type="spellStart"/>
+            <w:r>
+              <w:t>archivo_pdf</w:t>
+            </w:r>
+            <w:proofErr w:type="spellEnd"/>
+          </w:p>
+        </w:tc>
+      </w:tr>
+      <w:tr>
+        <w:tc>
+          <w:tcPr>
+            <w:cnfStyle w:val="001000000000" w:firstRow="0" w:lastRow="0" w:firstColumn="1" w:lastColumn="0" w:oddVBand="0" w:evenVBand="0" w:oddHBand="0" w:evenHBand="0" w:firstRowFirstColumn="0" w:firstRowLastColumn="0" w:lastRowFirstColumn="0" w:lastRowLastColumn="0"/>
+            <w:tcW w:w="2831" w:type="dxa"/>
+          </w:tcPr>
+          <w:p>
+            <w:pPr>
+              <w:ind w:firstLine="0"/>
+            </w:pPr>
+            <w:r>
+              <w:t>Notificación</w:t>
+            </w:r>
+          </w:p>
+        </w:tc>
+        <w:tc>
+          <w:tcPr>
+            <w:tcW w:w="2831" w:type="dxa"/>
+          </w:tcPr>
+          <w:p>
+            <w:pPr>
+              <w:ind w:firstLine="0"/>
+              <w:cnfStyle w:val="000000000000" w:firstRow="0" w:lastRow="0" w:firstColumn="0" w:lastColumn="0" w:oddVBand="0" w:evenVBand="0" w:oddHBand="0" w:evenHBand="0" w:firstRowFirstColumn="0" w:firstRowLastColumn="0" w:lastRowFirstColumn="0" w:lastRowLastColumn="0"/>
+            </w:pPr>
+            <w:r>
+              <w:t>Comunicación automática al turista</w:t>
+            </w:r>
+          </w:p>
+        </w:tc>
+        <w:tc>
+          <w:tcPr>
+            <w:tcW w:w="2832" w:type="dxa"/>
+          </w:tcPr>
+          <w:p>
+            <w:pPr>
+              <w:ind w:firstLine="0"/>
+              <w:cnfStyle w:val="000000000000" w:firstRow="0" w:lastRow="0" w:firstColumn="0" w:lastColumn="0" w:oddVBand="0" w:evenVBand="0" w:oddHBand="0" w:evenHBand="0" w:firstRowFirstColumn="0" w:firstRowLastColumn="0" w:lastRowFirstColumn="0" w:lastRowLastColumn="0"/>
+            </w:pPr>
+            <w:r>
+              <w:t xml:space="preserve">ID, turista, tipo, contenido, </w:t>
+            </w:r>
+            <w:proofErr w:type="spellStart"/>
+            <w:r>
+              <w:t>fecha_envío</w:t>
+            </w:r>
+            <w:proofErr w:type="spellEnd"/>
+            <w:r>
+              <w:t xml:space="preserve">, </w:t>
+            </w:r>
+            <w:proofErr w:type="spellStart"/>
+            <w:r>
+              <w:t>estado_lectura</w:t>
+            </w:r>
+            <w:proofErr w:type="spellEnd"/>
+          </w:p>
+        </w:tc>
+      </w:tr>
+    </w:tbl>
+    <w:p>
+      <w:r>
+        <w:rPr>
+          <w:i/>
+          <w:iCs/>
+        </w:rPr>
+        <w:t>Nota.</w:t>
+      </w:r>
+      <w:r>
+        <w:t xml:space="preserve"> Elaboración propia</w:t>
+      </w:r>
+    </w:p>
+    <w:p/>
+    <w:p>
+      <w:r>
+        <w:rPr>
+          <w:b/>
+          <w:bCs/>
+        </w:rPr>
+        <w:t>Relaciones principales:</w:t>
+      </w:r>
+    </w:p>
+    <w:p>
+      <w:pPr>
+        <w:numPr>
+          <w:ilvl w:val="0"/>
+          <w:numId w:val="1"/>
+        </w:numPr>
+      </w:pPr>
+      <w:r>
+        <w:t>Un Turista puede realizar múltiples Reservas</w:t>
+      </w:r>
+    </w:p>
+    <w:p>
+      <w:pPr>
+        <w:numPr>
+          <w:ilvl w:val="0"/>
+          <w:numId w:val="1"/>
+        </w:numPr>
+      </w:pPr>
+      <w:r>
+        <w:t>Una Reserva está asociada a un Paquete Turístico</w:t>
+      </w:r>
+    </w:p>
+    <w:p>
+      <w:pPr>
+        <w:numPr>
+          <w:ilvl w:val="0"/>
+          <w:numId w:val="1"/>
+        </w:numPr>
+      </w:pPr>
+      <w:r>
+        <w:t>Una Reserva genera un Pago</w:t>
+      </w:r>
+    </w:p>
+    <w:p>
+      <w:pPr>
+        <w:numPr>
+          <w:ilvl w:val="0"/>
+          <w:numId w:val="1"/>
+        </w:numPr>
+      </w:pPr>
+      <w:r>
+        <w:t>Un Pago genera un Comprobante</w:t>
+      </w:r>
+    </w:p>
+    <w:p>
+      <w:pPr>
+        <w:numPr>
+          <w:ilvl w:val="0"/>
+          <w:numId w:val="1"/>
+        </w:numPr>
+      </w:pPr>
+      <w:r>
+        <w:lastRenderedPageBreak/>
+        <w:t>Una Reserva puede generar múltiples Notificaciones</w:t>
+      </w:r>
+    </w:p>
+    <w:p/>
+    <w:p>
+      <w:pPr>
+        <w:pStyle w:val="Ttulo2"/>
+      </w:pPr>
+      <w:r>
+        <w:t>3.6. Glosario de Términos</w:t>
+      </w:r>
+    </w:p>
+    <w:p>
+      <w:pPr>
+        <w:rPr>
+          <w:b/>
+          <w:bCs/>
+        </w:rPr>
+      </w:pPr>
+      <w:r>
+        <w:rPr>
+          <w:b/>
+          <w:bCs/>
+        </w:rPr>
+        <w:t>Tabla 6.</w:t>
+      </w:r>
+    </w:p>
+    <w:p>
+      <w:pPr>
+        <w:rPr>
+          <w:i/>
+          <w:iCs/>
+        </w:rPr>
+      </w:pPr>
+      <w:r>
+        <w:rPr>
+          <w:i/>
+          <w:iCs/>
+        </w:rPr>
+        <w:t xml:space="preserve">Glosario de términos técnicos – Sistema </w:t>
+      </w:r>
+      <w:proofErr w:type="spellStart"/>
+      <w:r>
+        <w:rPr>
+          <w:i/>
+          <w:iCs/>
+        </w:rPr>
+        <w:t>Kuelap</w:t>
+      </w:r>
+      <w:proofErr w:type="spellEnd"/>
+      <w:r>
+        <w:rPr>
+          <w:i/>
+          <w:iCs/>
+        </w:rPr>
+        <w:t xml:space="preserve"> Travel</w:t>
+      </w:r>
+    </w:p>
+    <w:tbl>
+      <w:tblPr>
+        <w:tblStyle w:val="Tablanormal2"/>
+        <w:tblW w:w="0" w:type="auto"/>
+        <w:tblLook w:val="04A0" w:firstRow="1" w:lastRow="0" w:firstColumn="1" w:lastColumn="0" w:noHBand="0" w:noVBand="1"/>
+      </w:tblPr>
+      <w:tblGrid>
+        <w:gridCol w:w="2547"/>
+        <w:gridCol w:w="5947"/>
+      </w:tblGrid>
+      <w:tr>
+        <w:trPr>
+          <w:cnfStyle w:val="100000000000" w:firstRow="1" w:lastRow="0" w:firstColumn="0" w:lastColumn="0" w:oddVBand="0" w:evenVBand="0" w:oddHBand="0" w:evenHBand="0" w:firstRowFirstColumn="0" w:firstRowLastColumn="0" w:lastRowFirstColumn="0" w:lastRowLastColumn="0"/>
+        </w:trPr>
+        <w:tc>
+          <w:tcPr>
+            <w:cnfStyle w:val="001000000000" w:firstRow="0" w:lastRow="0" w:firstColumn="1" w:lastColumn="0" w:oddVBand="0" w:evenVBand="0" w:oddHBand="0" w:evenHBand="0" w:firstRowFirstColumn="0" w:firstRowLastColumn="0" w:lastRowFirstColumn="0" w:lastRowLastColumn="0"/>
+            <w:tcW w:w="2547" w:type="dxa"/>
+          </w:tcPr>
+          <w:p>
+            <w:pPr>
+              <w:ind w:firstLine="0"/>
+            </w:pPr>
+            <w:r>
+              <w:t>Término</w:t>
+            </w:r>
+          </w:p>
+        </w:tc>
+        <w:tc>
+          <w:tcPr>
+            <w:tcW w:w="5947" w:type="dxa"/>
+          </w:tcPr>
+          <w:p>
+            <w:pPr>
+              <w:ind w:firstLine="0"/>
+              <w:cnfStyle w:val="100000000000" w:firstRow="1" w:lastRow="0" w:firstColumn="0" w:lastColumn="0" w:oddVBand="0" w:evenVBand="0" w:oddHBand="0" w:evenHBand="0" w:firstRowFirstColumn="0" w:firstRowLastColumn="0" w:lastRowFirstColumn="0" w:lastRowLastColumn="0"/>
+            </w:pPr>
+            <w:r>
+              <w:t>Definición</w:t>
+            </w:r>
+          </w:p>
+        </w:tc>
+      </w:tr>
+      <w:tr>
+        <w:trPr>
+          <w:cnfStyle w:val="000000100000" w:firstRow="0" w:lastRow="0" w:firstColumn="0" w:lastColumn="0" w:oddVBand="0" w:evenVBand="0" w:oddHBand="1" w:evenHBand="0" w:firstRowFirstColumn="0" w:firstRowLastColumn="0" w:lastRowFirstColumn="0" w:lastRowLastColumn="0"/>
+        </w:trPr>
+        <w:tc>
+          <w:tcPr>
+            <w:cnfStyle w:val="001000000000" w:firstRow="0" w:lastRow="0" w:firstColumn="1" w:lastColumn="0" w:oddVBand="0" w:evenVBand="0" w:oddHBand="0" w:evenHBand="0" w:firstRowFirstColumn="0" w:firstRowLastColumn="0" w:lastRowFirstColumn="0" w:lastRowLastColumn="0"/>
+            <w:tcW w:w="2547" w:type="dxa"/>
+          </w:tcPr>
+          <w:p>
+            <w:pPr>
+              <w:ind w:firstLine="0"/>
+            </w:pPr>
+            <w:r>
+              <w:t>Autenticación</w:t>
+            </w:r>
+          </w:p>
+        </w:tc>
+        <w:tc>
+          <w:tcPr>
+            <w:tcW w:w="5947" w:type="dxa"/>
+          </w:tcPr>
+          <w:p>
+            <w:pPr>
+              <w:ind w:firstLine="0"/>
+              <w:cnfStyle w:val="000000100000" w:firstRow="0" w:lastRow="0" w:firstColumn="0" w:lastColumn="0" w:oddVBand="0" w:evenVBand="0" w:oddHBand="1" w:evenHBand="0" w:firstRowFirstColumn="0" w:firstRowLastColumn="0" w:lastRowFirstColumn="0" w:lastRowLastColumn="0"/>
+            </w:pPr>
+            <w:r>
+              <w:t>Proceso de verificación de identidad del usuario mediante credenciales (correo y contraseña)</w:t>
+            </w:r>
+          </w:p>
+        </w:tc>
+      </w:tr>
+      <w:tr>
+        <w:tc>
+          <w:tcPr>
+            <w:cnfStyle w:val="001000000000" w:firstRow="0" w:lastRow="0" w:firstColumn="1" w:lastColumn="0" w:oddVBand="0" w:evenVBand="0" w:oddHBand="0" w:evenHBand="0" w:firstRowFirstColumn="0" w:firstRowLastColumn="0" w:lastRowFirstColumn="0" w:lastRowLastColumn="0"/>
+            <w:tcW w:w="2547" w:type="dxa"/>
+          </w:tcPr>
+          <w:p>
+            <w:pPr>
+              <w:ind w:firstLine="0"/>
+            </w:pPr>
+            <w:r>
+              <w:t>Paquete Turístico</w:t>
+            </w:r>
+          </w:p>
+        </w:tc>
+        <w:tc>
+          <w:tcPr>
+            <w:tcW w:w="5947" w:type="dxa"/>
+          </w:tcPr>
+          <w:p>
+            <w:pPr>
+              <w:ind w:firstLine="0"/>
+              <w:cnfStyle w:val="000000000000" w:firstRow="0" w:lastRow="0" w:firstColumn="0" w:lastColumn="0" w:oddVBand="0" w:evenVBand="0" w:oddHBand="0" w:evenHBand="0" w:firstRowFirstColumn="0" w:firstRowLastColumn="0" w:lastRowFirstColumn="0" w:lastRowLastColumn="0"/>
+            </w:pPr>
+            <w:r>
+              <w:t>Oferta de viaje que incluye destino, itinerario, servicios y precio</w:t>
+            </w:r>
+          </w:p>
+        </w:tc>
+      </w:tr>
+      <w:tr>
+        <w:trPr>
+          <w:cnfStyle w:val="000000100000" w:firstRow="0" w:lastRow="0" w:firstColumn="0" w:lastColumn="0" w:oddVBand="0" w:evenVBand="0" w:oddHBand="1" w:evenHBand="0" w:firstRowFirstColumn="0" w:firstRowLastColumn="0" w:lastRowFirstColumn="0" w:lastRowLastColumn="0"/>
+        </w:trPr>
+        <w:tc>
+          <w:tcPr>
+            <w:cnfStyle w:val="001000000000" w:firstRow="0" w:lastRow="0" w:firstColumn="1" w:lastColumn="0" w:oddVBand="0" w:evenVBand="0" w:oddHBand="0" w:evenHBand="0" w:firstRowFirstColumn="0" w:firstRowLastColumn="0" w:lastRowFirstColumn="0" w:lastRowLastColumn="0"/>
+            <w:tcW w:w="2547" w:type="dxa"/>
+          </w:tcPr>
+          <w:p>
+            <w:pPr>
+              <w:ind w:firstLine="0"/>
+            </w:pPr>
+            <w:r>
+              <w:t>Reserva</w:t>
+            </w:r>
+          </w:p>
+        </w:tc>
+        <w:tc>
+          <w:tcPr>
+            <w:tcW w:w="5947" w:type="dxa"/>
+          </w:tcPr>
+          <w:p>
+            <w:pPr>
+              <w:ind w:firstLine="0"/>
+              <w:cnfStyle w:val="000000100000" w:firstRow="0" w:lastRow="0" w:firstColumn="0" w:lastColumn="0" w:oddVBand="0" w:evenVBand="0" w:oddHBand="1" w:evenHBand="0" w:firstRowFirstColumn="0" w:firstRowLastColumn="0" w:lastRowFirstColumn="0" w:lastRowLastColumn="0"/>
+            </w:pPr>
+            <w:r>
+              <w:t>Registro de la intención de compra de un paquete turístico por parte del turista</w:t>
+            </w:r>
+          </w:p>
+        </w:tc>
+      </w:tr>
+      <w:tr>
+        <w:tc>
+          <w:tcPr>
+            <w:cnfStyle w:val="001000000000" w:firstRow="0" w:lastRow="0" w:firstColumn="1" w:lastColumn="0" w:oddVBand="0" w:evenVBand="0" w:oddHBand="0" w:evenHBand="0" w:firstRowFirstColumn="0" w:firstRowLastColumn="0" w:lastRowFirstColumn="0" w:lastRowLastColumn="0"/>
+            <w:tcW w:w="2547" w:type="dxa"/>
+          </w:tcPr>
+          <w:p>
+            <w:pPr>
+              <w:ind w:firstLine="0"/>
+            </w:pPr>
+            <w:r>
+              <w:t>Disponibilidad</w:t>
+            </w:r>
+          </w:p>
+        </w:tc>
+        <w:tc>
+          <w:tcPr>
+            <w:tcW w:w="5947" w:type="dxa"/>
+          </w:tcPr>
+          <w:p>
+            <w:pPr>
+              <w:ind w:firstLine="0"/>
+              <w:cnfStyle w:val="000000000000" w:firstRow="0" w:lastRow="0" w:firstColumn="0" w:lastColumn="0" w:oddVBand="0" w:evenVBand="0" w:oddHBand="0" w:evenHBand="0" w:firstRowFirstColumn="0" w:firstRowLastColumn="0" w:lastRowFirstColumn="0" w:lastRowLastColumn="0"/>
+            </w:pPr>
+            <w:r>
+              <w:t>Cantidad de espacios disponibles en un paquete turístico</w:t>
+            </w:r>
+          </w:p>
+        </w:tc>
+      </w:tr>
+      <w:tr>
+        <w:trPr>
+          <w:cnfStyle w:val="000000100000" w:firstRow="0" w:lastRow="0" w:firstColumn="0" w:lastColumn="0" w:oddVBand="0" w:evenVBand="0" w:oddHBand="1" w:evenHBand="0" w:firstRowFirstColumn="0" w:firstRowLastColumn="0" w:lastRowFirstColumn="0" w:lastRowLastColumn="0"/>
+        </w:trPr>
+        <w:tc>
+          <w:tcPr>
+            <w:cnfStyle w:val="001000000000" w:firstRow="0" w:lastRow="0" w:firstColumn="1" w:lastColumn="0" w:oddVBand="0" w:evenVBand="0" w:oddHBand="0" w:evenHBand="0" w:firstRowFirstColumn="0" w:firstRowLastColumn="0" w:lastRowFirstColumn="0" w:lastRowLastColumn="0"/>
+            <w:tcW w:w="2547" w:type="dxa"/>
+          </w:tcPr>
+          <w:p>
+            <w:pPr>
+              <w:ind w:firstLine="0"/>
+            </w:pPr>
+            <w:r>
+              <w:t>Pago en línea</w:t>
+            </w:r>
+          </w:p>
+        </w:tc>
+        <w:tc>
+          <w:tcPr>
+            <w:tcW w:w="5947" w:type="dxa"/>
+          </w:tcPr>
+          <w:p>
+            <w:pPr>
+              <w:ind w:firstLine="0"/>
+              <w:cnfStyle w:val="000000100000" w:firstRow="0" w:lastRow="0" w:firstColumn="0" w:lastColumn="0" w:oddVBand="0" w:evenVBand="0" w:oddHBand="1" w:evenHBand="0" w:firstRowFirstColumn="0" w:firstRowLastColumn="0" w:lastRowFirstColumn="0" w:lastRowLastColumn="0"/>
+            </w:pPr>
+            <w:r>
+              <w:t>Transacción económica realizada a través de pasarelas de pago seguras</w:t>
+            </w:r>
+          </w:p>
+        </w:tc>
+      </w:tr>
+      <w:tr>
+        <w:tc>
+          <w:tcPr>
+            <w:cnfStyle w:val="001000000000" w:firstRow="0" w:lastRow="0" w:firstColumn="1" w:lastColumn="0" w:oddVBand="0" w:evenVBand="0" w:oddHBand="0" w:evenHBand="0" w:firstRowFirstColumn="0" w:firstRowLastColumn="0" w:lastRowFirstColumn="0" w:lastRowLastColumn="0"/>
+            <w:tcW w:w="2547" w:type="dxa"/>
+          </w:tcPr>
+          <w:p>
+            <w:pPr>
+              <w:ind w:firstLine="0"/>
+            </w:pPr>
+            <w:r>
+              <w:t>Comprobante digital</w:t>
+            </w:r>
+          </w:p>
+        </w:tc>
+        <w:tc>
+          <w:tcPr>
+            <w:tcW w:w="5947" w:type="dxa"/>
+          </w:tcPr>
+          <w:p>
+            <w:pPr>
+              <w:ind w:firstLine="0"/>
+              <w:cnfStyle w:val="000000000000" w:firstRow="0" w:lastRow="0" w:firstColumn="0" w:lastColumn="0" w:oddVBand="0" w:evenVBand="0" w:oddHBand="0" w:evenHBand="0" w:firstRowFirstColumn="0" w:firstRowLastColumn="0" w:lastRowFirstColumn="0" w:lastRowLastColumn="0"/>
+            </w:pPr>
+            <w:r>
+              <w:t>Documento electrónico (boleta o factura) que registra la transacción</w:t>
+            </w:r>
+          </w:p>
+        </w:tc>
+      </w:tr>
+      <w:tr>
+        <w:trPr>
+          <w:cnfStyle w:val="000000100000" w:firstRow="0" w:lastRow="0" w:firstColumn="0" w:lastColumn="0" w:oddVBand="0" w:evenVBand="0" w:oddHBand="1" w:evenHBand="0" w:firstRowFirstColumn="0" w:firstRowLastColumn="0" w:lastRowFirstColumn="0" w:lastRowLastColumn="0"/>
+        </w:trPr>
+        <w:tc>
+          <w:tcPr>
+            <w:cnfStyle w:val="001000000000" w:firstRow="0" w:lastRow="0" w:firstColumn="1" w:lastColumn="0" w:oddVBand="0" w:evenVBand="0" w:oddHBand="0" w:evenHBand="0" w:firstRowFirstColumn="0" w:firstRowLastColumn="0" w:lastRowFirstColumn="0" w:lastRowLastColumn="0"/>
+            <w:tcW w:w="2547" w:type="dxa"/>
+          </w:tcPr>
+          <w:p>
+            <w:pPr>
+              <w:ind w:firstLine="0"/>
+            </w:pPr>
+            <w:r>
+              <w:t>Notificación</w:t>
+            </w:r>
+          </w:p>
+        </w:tc>
+        <w:tc>
+          <w:tcPr>
+            <w:tcW w:w="5947" w:type="dxa"/>
+          </w:tcPr>
+          <w:p>
+            <w:pPr>
+              <w:ind w:firstLine="0"/>
+              <w:cnfStyle w:val="000000100000" w:firstRow="0" w:lastRow="0" w:firstColumn="0" w:lastColumn="0" w:oddVBand="0" w:evenVBand="0" w:oddHBand="1" w:evenHBand="0" w:firstRowFirstColumn="0" w:firstRowLastColumn="0" w:lastRowFirstColumn="0" w:lastRowLastColumn="0"/>
+            </w:pPr>
+            <w:r>
+              <w:t>Comunicación automática enviada al turista por correo electrónico</w:t>
+            </w:r>
+          </w:p>
+        </w:tc>
+      </w:tr>
+      <w:tr>
+        <w:tc>
+          <w:tcPr>
+            <w:cnfStyle w:val="001000000000" w:firstRow="0" w:lastRow="0" w:firstColumn="1" w:lastColumn="0" w:oddVBand="0" w:evenVBand="0" w:oddHBand="0" w:evenHBand="0" w:firstRowFirstColumn="0" w:firstRowLastColumn="0" w:lastRowFirstColumn="0" w:lastRowLastColumn="0"/>
+            <w:tcW w:w="2547" w:type="dxa"/>
+          </w:tcPr>
+          <w:p>
+            <w:pPr>
+              <w:ind w:firstLine="0"/>
+            </w:pPr>
+            <w:r>
+              <w:t>Historial de pagos</w:t>
+            </w:r>
+          </w:p>
+        </w:tc>
+        <w:tc>
+          <w:tcPr>
+            <w:tcW w:w="5947" w:type="dxa"/>
+          </w:tcPr>
+          <w:p>
+            <w:pPr>
+              <w:ind w:firstLine="0"/>
+              <w:cnfStyle w:val="000000000000" w:firstRow="0" w:lastRow="0" w:firstColumn="0" w:lastColumn="0" w:oddVBand="0" w:evenVBand="0" w:oddHBand="0" w:evenHBand="0" w:firstRowFirstColumn="0" w:firstRowLastColumn="0" w:lastRowFirstColumn="0" w:lastRowLastColumn="0"/>
+            </w:pPr>
+            <w:r>
+              <w:t>Registro de todas las transacciones realizadas por un turista</w:t>
+            </w:r>
+          </w:p>
+        </w:tc>
+      </w:tr>
+      <w:tr>
+        <w:trPr>
+          <w:cnfStyle w:val="000000100000" w:firstRow="0" w:lastRow="0" w:firstColumn="0" w:lastColumn="0" w:oddVBand="0" w:evenVBand="0" w:oddHBand="1" w:evenHBand="0" w:firstRowFirstColumn="0" w:firstRowLastColumn="0" w:lastRowFirstColumn="0" w:lastRowLastColumn="0"/>
+        </w:trPr>
+        <w:tc>
+          <w:tcPr>
+            <w:cnfStyle w:val="001000000000" w:firstRow="0" w:lastRow="0" w:firstColumn="1" w:lastColumn="0" w:oddVBand="0" w:evenVBand="0" w:oddHBand="0" w:evenHBand="0" w:firstRowFirstColumn="0" w:firstRowLastColumn="0" w:lastRowFirstColumn="0" w:lastRowLastColumn="0"/>
+            <w:tcW w:w="2547" w:type="dxa"/>
+          </w:tcPr>
+          <w:p>
+            <w:pPr>
+              <w:ind w:firstLine="0"/>
+            </w:pPr>
+            <w:r>
+              <w:t>Validación de pago</w:t>
+            </w:r>
+          </w:p>
+        </w:tc>
+        <w:tc>
+          <w:tcPr>
+            <w:tcW w:w="5947" w:type="dxa"/>
+          </w:tcPr>
+          <w:p>
+            <w:pPr>
+              <w:ind w:firstLine="0"/>
+              <w:cnfStyle w:val="000000100000" w:firstRow="0" w:lastRow="0" w:firstColumn="0" w:lastColumn="0" w:oddVBand="0" w:evenVBand="0" w:oddHBand="1" w:evenHBand="0" w:firstRowFirstColumn="0" w:firstRowLastColumn="0" w:lastRowFirstColumn="0" w:lastRowLastColumn="0"/>
+            </w:pPr>
+            <w:r>
+              <w:t>Verificación de que el pago se procesó correctamente antes de confirmar la reserva</w:t>
+            </w:r>
+          </w:p>
+        </w:tc>
+      </w:tr>
+      <w:tr>
+        <w:tc>
+          <w:tcPr>
+            <w:cnfStyle w:val="001000000000" w:firstRow="0" w:lastRow="0" w:firstColumn="1" w:lastColumn="0" w:oddVBand="0" w:evenVBand="0" w:oddHBand="0" w:evenHBand="0" w:firstRowFirstColumn="0" w:firstRowLastColumn="0" w:lastRowFirstColumn="0" w:lastRowLastColumn="0"/>
+            <w:tcW w:w="2547" w:type="dxa"/>
+          </w:tcPr>
+          <w:p>
+            <w:pPr>
+              <w:ind w:firstLine="0"/>
+            </w:pPr>
+            <w:r>
+              <w:t>Estado de reserva</w:t>
+            </w:r>
+          </w:p>
+        </w:tc>
+        <w:tc>
+          <w:tcPr>
+            <w:tcW w:w="5947" w:type="dxa"/>
+          </w:tcPr>
+          <w:p>
+            <w:pPr>
+              <w:ind w:firstLine="0"/>
+              <w:cnfStyle w:val="000000000000" w:firstRow="0" w:lastRow="0" w:firstColumn="0" w:lastColumn="0" w:oddVBand="0" w:evenVBand="0" w:oddHBand="0" w:evenHBand="0" w:firstRowFirstColumn="0" w:firstRowLastColumn="0" w:lastRowFirstColumn="0" w:lastRowLastColumn="0"/>
+            </w:pPr>
+            <w:r>
+              <w:t>Condición actual de la reserva (pendiente, confirmada, cancelada, completada)</w:t>
+            </w:r>
+          </w:p>
+        </w:tc>
+      </w:tr>
+      <w:tr>
+        <w:trPr>
+          <w:cnfStyle w:val="000000100000" w:firstRow="0" w:lastRow="0" w:firstColumn="0" w:lastColumn="0" w:oddVBand="0" w:evenVBand="0" w:oddHBand="1" w:evenHBand="0" w:firstRowFirstColumn="0" w:firstRowLastColumn="0" w:lastRowFirstColumn="0" w:lastRowLastColumn="0"/>
+        </w:trPr>
+        <w:tc>
+          <w:tcPr>
+            <w:cnfStyle w:val="001000000000" w:firstRow="0" w:lastRow="0" w:firstColumn="1" w:lastColumn="0" w:oddVBand="0" w:evenVBand="0" w:oddHBand="0" w:evenHBand="0" w:firstRowFirstColumn="0" w:firstRowLastColumn="0" w:lastRowFirstColumn="0" w:lastRowLastColumn="0"/>
+            <w:tcW w:w="2547" w:type="dxa"/>
+          </w:tcPr>
+          <w:p>
+            <w:pPr>
+              <w:ind w:firstLine="0"/>
+            </w:pPr>
+            <w:r>
+              <w:t>Itinerario</w:t>
+            </w:r>
+          </w:p>
+        </w:tc>
+        <w:tc>
+          <w:tcPr>
+            <w:tcW w:w="5947" w:type="dxa"/>
+          </w:tcPr>
+          <w:p>
+            <w:pPr>
+              <w:ind w:firstLine="0"/>
+              <w:cnfStyle w:val="000000100000" w:firstRow="0" w:lastRow="0" w:firstColumn="0" w:lastColumn="0" w:oddVBand="0" w:evenVBand="0" w:oddHBand="1" w:evenHBand="0" w:firstRowFirstColumn="0" w:firstRowLastColumn="0" w:lastRowFirstColumn="0" w:lastRowLastColumn="0"/>
+            </w:pPr>
+            <w:r>
+              <w:t>Descripción detallada de las actividades y fechas incluidas en el paquete turístico</w:t>
+            </w:r>
+          </w:p>
+        </w:tc>
+      </w:tr>
+      <w:tr>
+        <w:tc>
+          <w:tcPr>
+            <w:cnfStyle w:val="001000000000" w:firstRow="0" w:lastRow="0" w:firstColumn="1" w:lastColumn="0" w:oddVBand="0" w:evenVBand="0" w:oddHBand="0" w:evenHBand="0" w:firstRowFirstColumn="0" w:firstRowLastColumn="0" w:lastRowFirstColumn="0" w:lastRowLastColumn="0"/>
+            <w:tcW w:w="2547" w:type="dxa"/>
+          </w:tcPr>
+          <w:p>
+            <w:pPr>
+              <w:ind w:firstLine="0"/>
+            </w:pPr>
+            <w:proofErr w:type="spellStart"/>
+            <w:r>
+              <w:t>Dashboard</w:t>
+            </w:r>
+            <w:proofErr w:type="spellEnd"/>
+          </w:p>
+        </w:tc>
+        <w:tc>
+          <w:tcPr>
+            <w:tcW w:w="5947" w:type="dxa"/>
+          </w:tcPr>
+          <w:p>
+            <w:pPr>
+              <w:ind w:firstLine="0"/>
+              <w:cnfStyle w:val="000000000000" w:firstRow="0" w:lastRow="0" w:firstColumn="0" w:lastColumn="0" w:oddVBand="0" w:evenVBand="0" w:oddHBand="0" w:evenHBand="0" w:firstRowFirstColumn="0" w:firstRowLastColumn="0" w:lastRowFirstColumn="0" w:lastRowLastColumn="0"/>
+            </w:pPr>
+            <w:r>
+              <w:t>Panel de control que permite al administrador gestionar paquetes y reservas</w:t>
+            </w:r>
+          </w:p>
+        </w:tc>
+      </w:tr>
+      <w:tr>
+        <w:trPr>
+          <w:cnfStyle w:val="000000100000" w:firstRow="0" w:lastRow="0" w:firstColumn="0" w:lastColumn="0" w:oddVBand="0" w:evenVBand="0" w:oddHBand="1" w:evenHBand="0" w:firstRowFirstColumn="0" w:firstRowLastColumn="0" w:lastRowFirstColumn="0" w:lastRowLastColumn="0"/>
+        </w:trPr>
+        <w:tc>
+          <w:tcPr>
+            <w:cnfStyle w:val="001000000000" w:firstRow="0" w:lastRow="0" w:firstColumn="1" w:lastColumn="0" w:oddVBand="0" w:evenVBand="0" w:oddHBand="0" w:evenHBand="0" w:firstRowFirstColumn="0" w:firstRowLastColumn="0" w:lastRowFirstColumn="0" w:lastRowLastColumn="0"/>
+            <w:tcW w:w="2547" w:type="dxa"/>
+          </w:tcPr>
+          <w:p>
+            <w:pPr>
+              <w:ind w:firstLine="0"/>
+            </w:pPr>
+            <w:r>
+              <w:t>Sprint</w:t>
+            </w:r>
+          </w:p>
+        </w:tc>
+        <w:tc>
+          <w:tcPr>
+            <w:tcW w:w="5947" w:type="dxa"/>
+          </w:tcPr>
+          <w:p>
+            <w:pPr>
+              <w:ind w:firstLine="0"/>
+              <w:cnfStyle w:val="000000100000" w:firstRow="0" w:lastRow="0" w:firstColumn="0" w:lastColumn="0" w:oddVBand="0" w:evenVBand="0" w:oddHBand="1" w:evenHBand="0" w:firstRowFirstColumn="0" w:firstRowLastColumn="0" w:lastRowFirstColumn="0" w:lastRowLastColumn="0"/>
+            </w:pPr>
+            <w:r>
+              <w:t>Período de trabajo de dos semanas en el que se desarrollan funcionalidades específicas</w:t>
+            </w:r>
+          </w:p>
+        </w:tc>
+      </w:tr>
+      <w:tr>
+        <w:tc>
+          <w:tcPr>
+            <w:cnfStyle w:val="001000000000" w:firstRow="0" w:lastRow="0" w:firstColumn="1" w:lastColumn="0" w:oddVBand="0" w:evenVBand="0" w:oddHBand="0" w:evenHBand="0" w:firstRowFirstColumn="0" w:firstRowLastColumn="0" w:lastRowFirstColumn="0" w:lastRowLastColumn="0"/>
+            <w:tcW w:w="2547" w:type="dxa"/>
+          </w:tcPr>
+          <w:p>
+            <w:pPr>
+              <w:ind w:firstLine="0"/>
+            </w:pPr>
+            <w:r>
+              <w:t>Punto de historia</w:t>
+            </w:r>
+          </w:p>
+        </w:tc>
+        <w:tc>
+          <w:tcPr>
+            <w:tcW w:w="5947" w:type="dxa"/>
+          </w:tcPr>
+          <w:p>
+            <w:pPr>
+              <w:ind w:firstLine="0"/>
+              <w:cnfStyle w:val="000000000000" w:firstRow="0" w:lastRow="0" w:firstColumn="0" w:lastColumn="0" w:oddVBand="0" w:evenVBand="0" w:oddHBand="0" w:evenHBand="0" w:firstRowFirstColumn="0" w:firstRowLastColumn="0" w:lastRowFirstColumn="0" w:lastRowLastColumn="0"/>
+            </w:pPr>
+            <w:r>
+              <w:t>Unidad de medida para estimar la complejidad y esfuerzo de una historia de usuario</w:t>
+            </w:r>
+          </w:p>
+        </w:tc>
+      </w:tr>
+    </w:tbl>
+    <w:p>
+      <w:r>
+        <w:rPr>
+          <w:i/>
+          <w:iCs/>
+        </w:rPr>
+        <w:t>Nota.</w:t>
+      </w:r>
+      <w:r>
+        <w:t xml:space="preserve"> Elaboración propia</w:t>
+      </w:r>
+    </w:p>
+    <w:p>
+      <w:pPr>
+        <w:pStyle w:val="Ttulo2"/>
+      </w:pPr>
+      <w:r>
+        <w:lastRenderedPageBreak/>
+        <w:t>3.7. Casos de Uso – Flujos Principales</w:t>
+      </w:r>
+    </w:p>
+    <w:p>
+      <w:pPr>
+        <w:pStyle w:val="Ttulo3"/>
+      </w:pPr>
+      <w:r>
+        <w:t>3.7.1. Caso de Uso 1: Reservar un Paquete Turístico</w:t>
+      </w:r>
+    </w:p>
+    <w:p>
+      <w:pPr>
+        <w:rPr>
+          <w:b/>
+          <w:bCs/>
+        </w:rPr>
+      </w:pPr>
+      <w:r>
+        <w:rPr>
+          <w:b/>
+          <w:bCs/>
+        </w:rPr>
+        <w:t>Tabla 7.</w:t>
+      </w:r>
+    </w:p>
+    <w:p>
+      <w:pPr>
+        <w:rPr>
+          <w:i/>
+          <w:iCs/>
+        </w:rPr>
+      </w:pPr>
+      <w:r>
+        <w:rPr>
+          <w:i/>
+          <w:iCs/>
+        </w:rPr>
+        <w:t>Especificación del caso de uso: Reservar un Paquete Turístico</w:t>
+      </w:r>
+    </w:p>
+    <w:tbl>
+      <w:tblPr>
+        <w:tblStyle w:val="Tablanormal2"/>
+        <w:tblW w:w="0" w:type="auto"/>
+        <w:tblLook w:val="04A0" w:firstRow="1" w:lastRow="0" w:firstColumn="1" w:lastColumn="0" w:noHBand="0" w:noVBand="1"/>
+      </w:tblPr>
+      <w:tblGrid>
+        <w:gridCol w:w="2547"/>
+        <w:gridCol w:w="5947"/>
+      </w:tblGrid>
+      <w:tr>
+        <w:trPr>
+          <w:cnfStyle w:val="100000000000" w:firstRow="1" w:lastRow="0" w:firstColumn="0" w:lastColumn="0" w:oddVBand="0" w:evenVBand="0" w:oddHBand="0" w:evenHBand="0" w:firstRowFirstColumn="0" w:firstRowLastColumn="0" w:lastRowFirstColumn="0" w:lastRowLastColumn="0"/>
+        </w:trPr>
+        <w:tc>
+          <w:tcPr>
+            <w:cnfStyle w:val="001000000000" w:firstRow="0" w:lastRow="0" w:firstColumn="1" w:lastColumn="0" w:oddVBand="0" w:evenVBand="0" w:oddHBand="0" w:evenHBand="0" w:firstRowFirstColumn="0" w:firstRowLastColumn="0" w:lastRowFirstColumn="0" w:lastRowLastColumn="0"/>
+            <w:tcW w:w="2547" w:type="dxa"/>
+          </w:tcPr>
+          <w:p>
+            <w:pPr>
+              <w:ind w:firstLine="0"/>
+            </w:pPr>
+            <w:r>
+              <w:t>Atributo</w:t>
+            </w:r>
+          </w:p>
+        </w:tc>
+        <w:tc>
+          <w:tcPr>
+            <w:tcW w:w="5947" w:type="dxa"/>
+          </w:tcPr>
+          <w:p>
+            <w:pPr>
+              <w:ind w:firstLine="0"/>
+              <w:cnfStyle w:val="100000000000" w:firstRow="1" w:lastRow="0" w:firstColumn="0" w:lastColumn="0" w:oddVBand="0" w:evenVBand="0" w:oddHBand="0" w:evenHBand="0" w:firstRowFirstColumn="0" w:firstRowLastColumn="0" w:lastRowFirstColumn="0" w:lastRowLastColumn="0"/>
+            </w:pPr>
+            <w:r>
+              <w:t>Descripción</w:t>
+            </w:r>
+          </w:p>
+        </w:tc>
+      </w:tr>
+      <w:tr>
+        <w:trPr>
+          <w:cnfStyle w:val="000000100000" w:firstRow="0" w:lastRow="0" w:firstColumn="0" w:lastColumn="0" w:oddVBand="0" w:evenVBand="0" w:oddHBand="1" w:evenHBand="0" w:firstRowFirstColumn="0" w:firstRowLastColumn="0" w:lastRowFirstColumn="0" w:lastRowLastColumn="0"/>
+        </w:trPr>
+        <w:tc>
+          <w:tcPr>
+            <w:cnfStyle w:val="001000000000" w:firstRow="0" w:lastRow="0" w:firstColumn="1" w:lastColumn="0" w:oddVBand="0" w:evenVBand="0" w:oddHBand="0" w:evenHBand="0" w:firstRowFirstColumn="0" w:firstRowLastColumn="0" w:lastRowFirstColumn="0" w:lastRowLastColumn="0"/>
+            <w:tcW w:w="2547" w:type="dxa"/>
+          </w:tcPr>
+          <w:p>
+            <w:pPr>
+              <w:ind w:firstLine="0"/>
+            </w:pPr>
+            <w:r>
+              <w:t>Identificador</w:t>
+            </w:r>
+          </w:p>
+        </w:tc>
+        <w:tc>
+          <w:tcPr>
+            <w:tcW w:w="5947" w:type="dxa"/>
+          </w:tcPr>
+          <w:p>
+            <w:pPr>
+              <w:ind w:firstLine="0"/>
+              <w:cnfStyle w:val="000000100000" w:firstRow="0" w:lastRow="0" w:firstColumn="0" w:lastColumn="0" w:oddVBand="0" w:evenVBand="0" w:oddHBand="1" w:evenHBand="0" w:firstRowFirstColumn="0" w:firstRowLastColumn="0" w:lastRowFirstColumn="0" w:lastRowLastColumn="0"/>
+            </w:pPr>
+            <w:r>
+              <w:t>CU-01</w:t>
+            </w:r>
+          </w:p>
+        </w:tc>
+      </w:tr>
+      <w:tr>
+        <w:tc>
+          <w:tcPr>
+            <w:cnfStyle w:val="001000000000" w:firstRow="0" w:lastRow="0" w:firstColumn="1" w:lastColumn="0" w:oddVBand="0" w:evenVBand="0" w:oddHBand="0" w:evenHBand="0" w:firstRowFirstColumn="0" w:firstRowLastColumn="0" w:lastRowFirstColumn="0" w:lastRowLastColumn="0"/>
+            <w:tcW w:w="2547" w:type="dxa"/>
+          </w:tcPr>
+          <w:p>
+            <w:pPr>
+              <w:ind w:firstLine="0"/>
+            </w:pPr>
+            <w:r>
+              <w:t>Nombre</w:t>
+            </w:r>
+          </w:p>
+        </w:tc>
+        <w:tc>
+          <w:tcPr>
+            <w:tcW w:w="5947" w:type="dxa"/>
+          </w:tcPr>
+          <w:p>
+            <w:pPr>
+              <w:ind w:firstLine="0"/>
+              <w:cnfStyle w:val="000000000000" w:firstRow="0" w:lastRow="0" w:firstColumn="0" w:lastColumn="0" w:oddVBand="0" w:evenVBand="0" w:oddHBand="0" w:evenHBand="0" w:firstRowFirstColumn="0" w:firstRowLastColumn="0" w:lastRowFirstColumn="0" w:lastRowLastColumn="0"/>
+            </w:pPr>
+            <w:r>
+              <w:t>Reservar un Paquete Turístico</w:t>
+            </w:r>
+          </w:p>
+        </w:tc>
+      </w:tr>
+      <w:tr>
+        <w:trPr>
+          <w:cnfStyle w:val="000000100000" w:firstRow="0" w:lastRow="0" w:firstColumn="0" w:lastColumn="0" w:oddVBand="0" w:evenVBand="0" w:oddHBand="1" w:evenHBand="0" w:firstRowFirstColumn="0" w:firstRowLastColumn="0" w:lastRowFirstColumn="0" w:lastRowLastColumn="0"/>
+        </w:trPr>
+        <w:tc>
+          <w:tcPr>
+            <w:cnfStyle w:val="001000000000" w:firstRow="0" w:lastRow="0" w:firstColumn="1" w:lastColumn="0" w:oddVBand="0" w:evenVBand="0" w:oddHBand="0" w:evenHBand="0" w:firstRowFirstColumn="0" w:firstRowLastColumn="0" w:lastRowFirstColumn="0" w:lastRowLastColumn="0"/>
+            <w:tcW w:w="2547" w:type="dxa"/>
+          </w:tcPr>
+          <w:p>
+            <w:pPr>
+              <w:ind w:firstLine="0"/>
+            </w:pPr>
+            <w:r>
+              <w:t>Actores principales</w:t>
+            </w:r>
+          </w:p>
+        </w:tc>
+        <w:tc>
+          <w:tcPr>
+            <w:tcW w:w="5947" w:type="dxa"/>
+          </w:tcPr>
+          <w:p>
+            <w:pPr>
+              <w:ind w:firstLine="0"/>
+              <w:cnfStyle w:val="000000100000" w:firstRow="0" w:lastRow="0" w:firstColumn="0" w:lastColumn="0" w:oddVBand="0" w:evenVBand="0" w:oddHBand="1" w:evenHBand="0" w:firstRowFirstColumn="0" w:firstRowLastColumn="0" w:lastRowFirstColumn="0" w:lastRowLastColumn="0"/>
+            </w:pPr>
+            <w:r>
+              <w:t>Turista</w:t>
+            </w:r>
+          </w:p>
+        </w:tc>
+      </w:tr>
+      <w:tr>
+        <w:tc>
+          <w:tcPr>
+            <w:cnfStyle w:val="001000000000" w:firstRow="0" w:lastRow="0" w:firstColumn="1" w:lastColumn="0" w:oddVBand="0" w:evenVBand="0" w:oddHBand="0" w:evenHBand="0" w:firstRowFirstColumn="0" w:firstRowLastColumn="0" w:lastRowFirstColumn="0" w:lastRowLastColumn="0"/>
+            <w:tcW w:w="2547" w:type="dxa"/>
+          </w:tcPr>
+          <w:p>
+            <w:pPr>
+              <w:ind w:firstLine="0"/>
+            </w:pPr>
+            <w:r>
+              <w:t>Actores secundarios</w:t>
+            </w:r>
+          </w:p>
+        </w:tc>
+        <w:tc>
+          <w:tcPr>
+            <w:tcW w:w="5947" w:type="dxa"/>
+          </w:tcPr>
+          <w:p>
+            <w:pPr>
+              <w:ind w:firstLine="0"/>
+              <w:cnfStyle w:val="000000000000" w:firstRow="0" w:lastRow="0" w:firstColumn="0" w:lastColumn="0" w:oddVBand="0" w:evenVBand="0" w:oddHBand="0" w:evenHBand="0" w:firstRowFirstColumn="0" w:firstRowLastColumn="0" w:lastRowFirstColumn="0" w:lastRowLastColumn="0"/>
+            </w:pPr>
+            <w:r>
+              <w:t xml:space="preserve">Sistema </w:t>
+            </w:r>
+            <w:proofErr w:type="spellStart"/>
+            <w:r>
+              <w:t>Kuelap</w:t>
+            </w:r>
+            <w:proofErr w:type="spellEnd"/>
+            <w:r>
+              <w:t xml:space="preserve"> Travel</w:t>
+            </w:r>
+          </w:p>
+        </w:tc>
+      </w:tr>
+      <w:tr>
+        <w:trPr>
+          <w:cnfStyle w:val="000000100000" w:firstRow="0" w:lastRow="0" w:firstColumn="0" w:lastColumn="0" w:oddVBand="0" w:evenVBand="0" w:oddHBand="1" w:evenHBand="0" w:firstRowFirstColumn="0" w:firstRowLastColumn="0" w:lastRowFirstColumn="0" w:lastRowLastColumn="0"/>
+        </w:trPr>
+        <w:tc>
+          <w:tcPr>
+            <w:cnfStyle w:val="001000000000" w:firstRow="0" w:lastRow="0" w:firstColumn="1" w:lastColumn="0" w:oddVBand="0" w:evenVBand="0" w:oddHBand="0" w:evenHBand="0" w:firstRowFirstColumn="0" w:firstRowLastColumn="0" w:lastRowFirstColumn="0" w:lastRowLastColumn="0"/>
+            <w:tcW w:w="2547" w:type="dxa"/>
+          </w:tcPr>
+          <w:p>
+            <w:pPr>
+              <w:ind w:firstLine="0"/>
+            </w:pPr>
+            <w:r>
+              <w:t>Precondiciones</w:t>
+            </w:r>
+          </w:p>
+        </w:tc>
+        <w:tc>
+          <w:tcPr>
+            <w:tcW w:w="5947" w:type="dxa"/>
+          </w:tcPr>
+          <w:p>
+            <w:pPr>
+              <w:ind w:firstLine="0"/>
+              <w:cnfStyle w:val="000000100000" w:firstRow="0" w:lastRow="0" w:firstColumn="0" w:lastColumn="0" w:oddVBand="0" w:evenVBand="0" w:oddHBand="1" w:evenHBand="0" w:firstRowFirstColumn="0" w:firstRowLastColumn="0" w:lastRowFirstColumn="0" w:lastRowLastColumn="0"/>
+            </w:pPr>
+            <w:r>
+              <w:t>El turista debe estar autenticado en el sistema</w:t>
+            </w:r>
+          </w:p>
+        </w:tc>
+      </w:tr>
+      <w:tr>
+        <w:tc>
+          <w:tcPr>
+            <w:cnfStyle w:val="001000000000" w:firstRow="0" w:lastRow="0" w:firstColumn="1" w:lastColumn="0" w:oddVBand="0" w:evenVBand="0" w:oddHBand="0" w:evenHBand="0" w:firstRowFirstColumn="0" w:firstRowLastColumn="0" w:lastRowFirstColumn="0" w:lastRowLastColumn="0"/>
+            <w:tcW w:w="2547" w:type="dxa"/>
+          </w:tcPr>
+          <w:p>
+            <w:pPr>
+              <w:ind w:firstLine="0"/>
+            </w:pPr>
+            <w:r>
+              <w:t>Flujo principal</w:t>
+            </w:r>
+          </w:p>
+        </w:tc>
+        <w:tc>
+          <w:tcPr>
+            <w:tcW w:w="5947" w:type="dxa"/>
+          </w:tcPr>
+          <w:p>
+            <w:pPr>
+              <w:ind w:firstLine="0"/>
+              <w:cnfStyle w:val="000000000000" w:firstRow="0" w:lastRow="0" w:firstColumn="0" w:lastColumn="0" w:oddVBand="0" w:evenVBand="0" w:oddHBand="0" w:evenHBand="0" w:firstRowFirstColumn="0" w:firstRowLastColumn="0" w:lastRowFirstColumn="0" w:lastRowLastColumn="0"/>
+            </w:pPr>
+            <w:r>
+              <w:t>1. El turista selecciona un paquete turístico del catálogo</w:t>
+            </w:r>
+          </w:p>
+          <w:p>
+            <w:pPr>
+              <w:ind w:firstLine="0"/>
+              <w:cnfStyle w:val="000000000000" w:firstRow="0" w:lastRow="0" w:firstColumn="0" w:lastColumn="0" w:oddVBand="0" w:evenVBand="0" w:oddHBand="0" w:evenHBand="0" w:firstRowFirstColumn="0" w:firstRowLastColumn="0" w:lastRowFirstColumn="0" w:lastRowLastColumn="0"/>
+            </w:pPr>
+            <w:r>
+              <w:t>2. El turista revisa los detalles del paquete (descripción, itinerario, precio, fotos)</w:t>
+            </w:r>
+          </w:p>
+          <w:p>
+            <w:pPr>
+              <w:ind w:firstLine="0"/>
+              <w:cnfStyle w:val="000000000000" w:firstRow="0" w:lastRow="0" w:firstColumn="0" w:lastColumn="0" w:oddVBand="0" w:evenVBand="0" w:oddHBand="0" w:evenHBand="0" w:firstRowFirstColumn="0" w:firstRowLastColumn="0" w:lastRowFirstColumn="0" w:lastRowLastColumn="0"/>
+            </w:pPr>
+            <w:r>
+              <w:t>3. El sistema verifica la disponibilidad del paquete</w:t>
+            </w:r>
+          </w:p>
+          <w:p>
+            <w:pPr>
+              <w:ind w:firstLine="0"/>
+              <w:cnfStyle w:val="000000000000" w:firstRow="0" w:lastRow="0" w:firstColumn="0" w:lastColumn="0" w:oddVBand="0" w:evenVBand="0" w:oddHBand="0" w:evenHBand="0" w:firstRowFirstColumn="0" w:firstRowLastColumn="0" w:lastRowFirstColumn="0" w:lastRowLastColumn="0"/>
+            </w:pPr>
+            <w:r>
+              <w:t>4. El turista ingresa la cantidad de personas para la reserva</w:t>
+            </w:r>
+          </w:p>
+          <w:p>
+            <w:pPr>
+              <w:ind w:firstLine="0"/>
+              <w:cnfStyle w:val="000000000000" w:firstRow="0" w:lastRow="0" w:firstColumn="0" w:lastColumn="0" w:oddVBand="0" w:evenVBand="0" w:oddHBand="0" w:evenHBand="0" w:firstRowFirstColumn="0" w:firstRowLastColumn="0" w:lastRowFirstColumn="0" w:lastRowLastColumn="0"/>
+            </w:pPr>
+            <w:r>
+              <w:t>5. El turista confirma la reserva</w:t>
+            </w:r>
+          </w:p>
+          <w:p>
+            <w:pPr>
+              <w:ind w:firstLine="0"/>
+              <w:cnfStyle w:val="000000000000" w:firstRow="0" w:lastRow="0" w:firstColumn="0" w:lastColumn="0" w:oddVBand="0" w:evenVBand="0" w:oddHBand="0" w:evenHBand="0" w:firstRowFirstColumn="0" w:firstRowLastColumn="0" w:lastRowFirstColumn="0" w:lastRowLastColumn="0"/>
+            </w:pPr>
+            <w:r>
+              <w:t>6. El sistema registra la reserva con estado "Pendiente de pago"</w:t>
+            </w:r>
+          </w:p>
+          <w:p>
+            <w:pPr>
+              <w:ind w:firstLine="0"/>
+              <w:cnfStyle w:val="000000000000" w:firstRow="0" w:lastRow="0" w:firstColumn="0" w:lastColumn="0" w:oddVBand="0" w:evenVBand="0" w:oddHBand="0" w:evenHBand="0" w:firstRowFirstColumn="0" w:firstRowLastColumn="0" w:lastRowFirstColumn="0" w:lastRowLastColumn="0"/>
+            </w:pPr>
+            <w:r>
+              <w:t>7. El sistema redirige al turista al proceso de pago</w:t>
+            </w:r>
+          </w:p>
+        </w:tc>
+      </w:tr>
+      <w:tr>
+        <w:trPr>
+          <w:cnfStyle w:val="000000100000" w:firstRow="0" w:lastRow="0" w:firstColumn="0" w:lastColumn="0" w:oddVBand="0" w:evenVBand="0" w:oddHBand="1" w:evenHBand="0" w:firstRowFirstColumn="0" w:firstRowLastColumn="0" w:lastRowFirstColumn="0" w:lastRowLastColumn="0"/>
+        </w:trPr>
+        <w:tc>
+          <w:tcPr>
+            <w:cnfStyle w:val="001000000000" w:firstRow="0" w:lastRow="0" w:firstColumn="1" w:lastColumn="0" w:oddVBand="0" w:evenVBand="0" w:oddHBand="0" w:evenHBand="0" w:firstRowFirstColumn="0" w:firstRowLastColumn="0" w:lastRowFirstColumn="0" w:lastRowLastColumn="0"/>
+            <w:tcW w:w="2547" w:type="dxa"/>
+          </w:tcPr>
+          <w:p>
+            <w:pPr>
+              <w:ind w:firstLine="0"/>
+            </w:pPr>
+            <w:r>
+              <w:t>Flujos alternativos</w:t>
+            </w:r>
+          </w:p>
+        </w:tc>
+        <w:tc>
+          <w:tcPr>
+            <w:tcW w:w="5947" w:type="dxa"/>
+          </w:tcPr>
+          <w:p>
+            <w:pPr>
+              <w:ind w:firstLine="0"/>
+              <w:cnfStyle w:val="000000100000" w:firstRow="0" w:lastRow="0" w:firstColumn="0" w:lastColumn="0" w:oddVBand="0" w:evenVBand="0" w:oddHBand="1" w:evenHBand="0" w:firstRowFirstColumn="0" w:firstRowLastColumn="0" w:lastRowFirstColumn="0" w:lastRowLastColumn="0"/>
+              <w:rPr>
+                <w:b/>
+                <w:bCs/>
+              </w:rPr>
+            </w:pPr>
+            <w:r>
+              <w:rPr>
+                <w:b/>
+                <w:bCs/>
+              </w:rPr>
+              <w:t>FA1 - Paquete sin disponibilidad:</w:t>
+            </w:r>
+          </w:p>
+          <w:p>
+            <w:pPr>
+              <w:ind w:firstLine="0"/>
+              <w:cnfStyle w:val="000000100000" w:firstRow="0" w:lastRow="0" w:firstColumn="0" w:lastColumn="0" w:oddVBand="0" w:evenVBand="0" w:oddHBand="1" w:evenHBand="0" w:firstRowFirstColumn="0" w:firstRowLastColumn="0" w:lastRowFirstColumn="0" w:lastRowLastColumn="0"/>
+            </w:pPr>
+            <w:r>
+              <w:t>En el paso 3, si el paquete no tiene disponibilidad, el sistema muestra un mensaje de error y permite al turista seleccionar otro paquete</w:t>
+            </w:r>
+          </w:p>
+          <w:p>
+            <w:pPr>
+              <w:ind w:firstLine="0"/>
+              <w:cnfStyle w:val="000000100000" w:firstRow="0" w:lastRow="0" w:firstColumn="0" w:lastColumn="0" w:oddVBand="0" w:evenVBand="0" w:oddHBand="1" w:evenHBand="0" w:firstRowFirstColumn="0" w:firstRowLastColumn="0" w:lastRowFirstColumn="0" w:lastRowLastColumn="0"/>
+            </w:pPr>
+            <w:r>
+              <w:rPr>
+                <w:b/>
+                <w:bCs/>
+              </w:rPr>
+              <w:t>FA2 - Turista no autenticado</w:t>
+            </w:r>
+            <w:r>
+              <w:t>:</w:t>
+            </w:r>
+          </w:p>
+          <w:p>
+            <w:pPr>
+              <w:ind w:firstLine="0"/>
+              <w:cnfStyle w:val="000000100000" w:firstRow="0" w:lastRow="0" w:firstColumn="0" w:lastColumn="0" w:oddVBand="0" w:evenVBand="0" w:oddHBand="1" w:evenHBand="0" w:firstRowFirstColumn="0" w:firstRowLastColumn="0" w:lastRowFirstColumn="0" w:lastRowLastColumn="0"/>
+            </w:pPr>
+            <w:r>
+              <w:t xml:space="preserve">Si el turista intenta reservar sin estar autenticado, el sistema lo redirige al </w:t>
+            </w:r>
+            <w:proofErr w:type="spellStart"/>
+            <w:r>
+              <w:t>login</w:t>
+            </w:r>
+            <w:proofErr w:type="spellEnd"/>
+          </w:p>
+        </w:tc>
+      </w:tr>
+      <w:tr>
+        <w:tc>
+          <w:tcPr>
+            <w:cnfStyle w:val="001000000000" w:firstRow="0" w:lastRow="0" w:firstColumn="1" w:lastColumn="0" w:oddVBand="0" w:evenVBand="0" w:oddHBand="0" w:evenHBand="0" w:firstRowFirstColumn="0" w:firstRowLastColumn="0" w:lastRowFirstColumn="0" w:lastRowLastColumn="0"/>
+            <w:tcW w:w="2547" w:type="dxa"/>
+          </w:tcPr>
+          <w:p>
+            <w:pPr>
+              <w:ind w:firstLine="0"/>
+            </w:pPr>
+            <w:r>
+              <w:t>Postcondiciones</w:t>
+            </w:r>
+          </w:p>
+        </w:tc>
+        <w:tc>
+          <w:tcPr>
+            <w:tcW w:w="5947" w:type="dxa"/>
+          </w:tcPr>
+          <w:p>
+            <w:pPr>
+              <w:ind w:firstLine="0"/>
+              <w:cnfStyle w:val="000000000000" w:firstRow="0" w:lastRow="0" w:firstColumn="0" w:lastColumn="0" w:oddVBand="0" w:evenVBand="0" w:oddHBand="0" w:evenHBand="0" w:firstRowFirstColumn="0" w:firstRowLastColumn="0" w:lastRowFirstColumn="0" w:lastRowLastColumn="0"/>
+            </w:pPr>
+            <w:r>
+              <w:t>La reserva queda registrada en el sistema con estado "Pendiente de pago"</w:t>
+            </w:r>
+          </w:p>
+        </w:tc>
+      </w:tr>
+      <w:tr>
+        <w:trPr>
+          <w:cnfStyle w:val="000000100000" w:firstRow="0" w:lastRow="0" w:firstColumn="0" w:lastColumn="0" w:oddVBand="0" w:evenVBand="0" w:oddHBand="1" w:evenHBand="0" w:firstRowFirstColumn="0" w:firstRowLastColumn="0" w:lastRowFirstColumn="0" w:lastRowLastColumn="0"/>
+        </w:trPr>
+        <w:tc>
+          <w:tcPr>
+            <w:cnfStyle w:val="001000000000" w:firstRow="0" w:lastRow="0" w:firstColumn="1" w:lastColumn="0" w:oddVBand="0" w:evenVBand="0" w:oddHBand="0" w:evenHBand="0" w:firstRowFirstColumn="0" w:firstRowLastColumn="0" w:lastRowFirstColumn="0" w:lastRowLastColumn="0"/>
+            <w:tcW w:w="2547" w:type="dxa"/>
+          </w:tcPr>
+          <w:p>
+            <w:pPr>
+              <w:ind w:firstLine="0"/>
+            </w:pPr>
+            <w:r>
+              <w:t>Notas</w:t>
+            </w:r>
+          </w:p>
+        </w:tc>
+        <w:tc>
+          <w:tcPr>
+            <w:tcW w:w="5947" w:type="dxa"/>
+          </w:tcPr>
+          <w:p>
+            <w:pPr>
+              <w:ind w:firstLine="0"/>
+              <w:cnfStyle w:val="000000100000" w:firstRow="0" w:lastRow="0" w:firstColumn="0" w:lastColumn="0" w:oddVBand="0" w:evenVBand="0" w:oddHBand="1" w:evenHBand="0" w:firstRowFirstColumn="0" w:firstRowLastColumn="0" w:lastRowFirstColumn="0" w:lastRowLastColumn="0"/>
+            </w:pPr>
+            <w:r>
+              <w:t>Una reserva puede incluir múltiples personas. El sistema debe validar que la cantidad de personas sea compatible con la disponibilidad</w:t>
+            </w:r>
+          </w:p>
+        </w:tc>
+      </w:tr>
+    </w:tbl>
+    <w:p>
+      <w:r>
+        <w:rPr>
+          <w:i/>
+          <w:iCs/>
+        </w:rPr>
+        <w:t>Nota.</w:t>
+      </w:r>
+      <w:r>
+        <w:t xml:space="preserve"> Elaboración propia</w:t>
+      </w:r>
+    </w:p>
+    <w:p/>
+    <w:p>
+      <w:pPr>
+        <w:pStyle w:val="Ttulo3"/>
+      </w:pPr>
+      <w:r>
+        <w:lastRenderedPageBreak/>
+        <w:t>3.7.2. Caso de Uso 2: Realizar Pago de Reserva</w:t>
+      </w:r>
+    </w:p>
+    <w:p>
+      <w:r>
+        <w:rPr>
+          <w:b/>
+          <w:bCs/>
+        </w:rPr>
+        <w:t>Tabla 8</w:t>
+      </w:r>
+    </w:p>
+    <w:p>
+      <w:r>
+        <w:rPr>
+          <w:i/>
+          <w:iCs/>
+        </w:rPr>
+        <w:t>Especificación del caso de uso: Realizar Pago de Reserva</w:t>
+      </w:r>
+    </w:p>
+    <w:tbl>
+      <w:tblPr>
+        <w:tblStyle w:val="Tablanormal2"/>
+        <w:tblW w:w="0" w:type="auto"/>
+        <w:tblLook w:val="04A0" w:firstRow="1" w:lastRow="0" w:firstColumn="1" w:lastColumn="0" w:noHBand="0" w:noVBand="1"/>
+      </w:tblPr>
+      <w:tblGrid>
+        <w:gridCol w:w="2547"/>
+        <w:gridCol w:w="5947"/>
+      </w:tblGrid>
+      <w:tr>
+        <w:trPr>
+          <w:cnfStyle w:val="100000000000" w:firstRow="1" w:lastRow="0" w:firstColumn="0" w:lastColumn="0" w:oddVBand="0" w:evenVBand="0" w:oddHBand="0" w:evenHBand="0" w:firstRowFirstColumn="0" w:firstRowLastColumn="0" w:lastRowFirstColumn="0" w:lastRowLastColumn="0"/>
+        </w:trPr>
+        <w:tc>
+          <w:tcPr>
+            <w:cnfStyle w:val="001000000000" w:firstRow="0" w:lastRow="0" w:firstColumn="1" w:lastColumn="0" w:oddVBand="0" w:evenVBand="0" w:oddHBand="0" w:evenHBand="0" w:firstRowFirstColumn="0" w:firstRowLastColumn="0" w:lastRowFirstColumn="0" w:lastRowLastColumn="0"/>
+            <w:tcW w:w="2547" w:type="dxa"/>
+          </w:tcPr>
+          <w:p>
+            <w:pPr>
+              <w:ind w:firstLine="0"/>
+            </w:pPr>
+            <w:r>
+              <w:t>Atributo</w:t>
+            </w:r>
+          </w:p>
+        </w:tc>
+        <w:tc>
+          <w:tcPr>
+            <w:tcW w:w="5947" w:type="dxa"/>
+          </w:tcPr>
+          <w:p>
+            <w:pPr>
+              <w:ind w:firstLine="0"/>
+              <w:cnfStyle w:val="100000000000" w:firstRow="1" w:lastRow="0" w:firstColumn="0" w:lastColumn="0" w:oddVBand="0" w:evenVBand="0" w:oddHBand="0" w:evenHBand="0" w:firstRowFirstColumn="0" w:firstRowLastColumn="0" w:lastRowFirstColumn="0" w:lastRowLastColumn="0"/>
+            </w:pPr>
+            <w:r>
+              <w:t>Descripción</w:t>
+            </w:r>
+          </w:p>
+        </w:tc>
+      </w:tr>
+      <w:tr>
+        <w:trPr>
+          <w:cnfStyle w:val="000000100000" w:firstRow="0" w:lastRow="0" w:firstColumn="0" w:lastColumn="0" w:oddVBand="0" w:evenVBand="0" w:oddHBand="1" w:evenHBand="0" w:firstRowFirstColumn="0" w:firstRowLastColumn="0" w:lastRowFirstColumn="0" w:lastRowLastColumn="0"/>
+        </w:trPr>
+        <w:tc>
+          <w:tcPr>
+            <w:cnfStyle w:val="001000000000" w:firstRow="0" w:lastRow="0" w:firstColumn="1" w:lastColumn="0" w:oddVBand="0" w:evenVBand="0" w:oddHBand="0" w:evenHBand="0" w:firstRowFirstColumn="0" w:firstRowLastColumn="0" w:lastRowFirstColumn="0" w:lastRowLastColumn="0"/>
+            <w:tcW w:w="2547" w:type="dxa"/>
+          </w:tcPr>
+          <w:p>
+            <w:pPr>
+              <w:ind w:firstLine="0"/>
+            </w:pPr>
+            <w:r>
+              <w:t>Identificador</w:t>
+            </w:r>
+          </w:p>
+        </w:tc>
+        <w:tc>
+          <w:tcPr>
+            <w:tcW w:w="5947" w:type="dxa"/>
+          </w:tcPr>
+          <w:p>
+            <w:pPr>
+              <w:ind w:firstLine="0"/>
+              <w:cnfStyle w:val="000000100000" w:firstRow="0" w:lastRow="0" w:firstColumn="0" w:lastColumn="0" w:oddVBand="0" w:evenVBand="0" w:oddHBand="1" w:evenHBand="0" w:firstRowFirstColumn="0" w:firstRowLastColumn="0" w:lastRowFirstColumn="0" w:lastRowLastColumn="0"/>
+            </w:pPr>
+            <w:r>
+              <w:t>CU-0</w:t>
+            </w:r>
+            <w:r>
+              <w:t>2</w:t>
+            </w:r>
+          </w:p>
+        </w:tc>
+      </w:tr>
+      <w:tr>
+        <w:tc>
+          <w:tcPr>
+            <w:cnfStyle w:val="001000000000" w:firstRow="0" w:lastRow="0" w:firstColumn="1" w:lastColumn="0" w:oddVBand="0" w:evenVBand="0" w:oddHBand="0" w:evenHBand="0" w:firstRowFirstColumn="0" w:firstRowLastColumn="0" w:lastRowFirstColumn="0" w:lastRowLastColumn="0"/>
+            <w:tcW w:w="2547" w:type="dxa"/>
+          </w:tcPr>
+          <w:p>
+            <w:pPr>
+              <w:ind w:firstLine="0"/>
+            </w:pPr>
+            <w:r>
+              <w:t>Nombre</w:t>
+            </w:r>
+          </w:p>
+        </w:tc>
+        <w:tc>
+          <w:tcPr>
+            <w:tcW w:w="5947" w:type="dxa"/>
+          </w:tcPr>
+          <w:p>
+            <w:pPr>
+              <w:ind w:firstLine="0"/>
+              <w:cnfStyle w:val="000000000000" w:firstRow="0" w:lastRow="0" w:firstColumn="0" w:lastColumn="0" w:oddVBand="0" w:evenVBand="0" w:oddHBand="0" w:evenHBand="0" w:firstRowFirstColumn="0" w:firstRowLastColumn="0" w:lastRowFirstColumn="0" w:lastRowLastColumn="0"/>
+            </w:pPr>
+            <w:r>
+              <w:t>Realizar Pago de Reserva</w:t>
+            </w:r>
+          </w:p>
+        </w:tc>
+      </w:tr>
+      <w:tr>
+        <w:trPr>
+          <w:cnfStyle w:val="000000100000" w:firstRow="0" w:lastRow="0" w:firstColumn="0" w:lastColumn="0" w:oddVBand="0" w:evenVBand="0" w:oddHBand="1" w:evenHBand="0" w:firstRowFirstColumn="0" w:firstRowLastColumn="0" w:lastRowFirstColumn="0" w:lastRowLastColumn="0"/>
+        </w:trPr>
+        <w:tc>
+          <w:tcPr>
+            <w:cnfStyle w:val="001000000000" w:firstRow="0" w:lastRow="0" w:firstColumn="1" w:lastColumn="0" w:oddVBand="0" w:evenVBand="0" w:oddHBand="0" w:evenHBand="0" w:firstRowFirstColumn="0" w:firstRowLastColumn="0" w:lastRowFirstColumn="0" w:lastRowLastColumn="0"/>
+            <w:tcW w:w="2547" w:type="dxa"/>
+          </w:tcPr>
+          <w:p>
+            <w:pPr>
+              <w:ind w:firstLine="0"/>
+            </w:pPr>
+            <w:r>
+              <w:t>Actores principales</w:t>
+            </w:r>
+          </w:p>
+        </w:tc>
+        <w:tc>
+          <w:tcPr>
+            <w:tcW w:w="5947" w:type="dxa"/>
+          </w:tcPr>
+          <w:p>
+            <w:pPr>
+              <w:ind w:firstLine="0"/>
+              <w:cnfStyle w:val="000000100000" w:firstRow="0" w:lastRow="0" w:firstColumn="0" w:lastColumn="0" w:oddVBand="0" w:evenVBand="0" w:oddHBand="1" w:evenHBand="0" w:firstRowFirstColumn="0" w:firstRowLastColumn="0" w:lastRowFirstColumn="0" w:lastRowLastColumn="0"/>
+            </w:pPr>
+            <w:r>
+              <w:t>Turista</w:t>
+            </w:r>
+          </w:p>
+        </w:tc>
+      </w:tr>
+      <w:tr>
+        <w:tc>
+          <w:tcPr>
+            <w:cnfStyle w:val="001000000000" w:firstRow="0" w:lastRow="0" w:firstColumn="1" w:lastColumn="0" w:oddVBand="0" w:evenVBand="0" w:oddHBand="0" w:evenHBand="0" w:firstRowFirstColumn="0" w:firstRowLastColumn="0" w:lastRowFirstColumn="0" w:lastRowLastColumn="0"/>
+            <w:tcW w:w="2547" w:type="dxa"/>
+          </w:tcPr>
+          <w:p>
+            <w:pPr>
+              <w:ind w:firstLine="0"/>
+            </w:pPr>
+            <w:r>
+              <w:t>Actores secundarios</w:t>
+            </w:r>
+          </w:p>
+        </w:tc>
+        <w:tc>
+          <w:tcPr>
+            <w:tcW w:w="5947" w:type="dxa"/>
+          </w:tcPr>
+          <w:p>
+            <w:pPr>
+              <w:ind w:firstLine="0"/>
+              <w:cnfStyle w:val="000000000000" w:firstRow="0" w:lastRow="0" w:firstColumn="0" w:lastColumn="0" w:oddVBand="0" w:evenVBand="0" w:oddHBand="0" w:evenHBand="0" w:firstRowFirstColumn="0" w:firstRowLastColumn="0" w:lastRowFirstColumn="0" w:lastRowLastColumn="0"/>
+            </w:pPr>
+            <w:r>
+              <w:t>S</w:t>
+            </w:r>
+            <w:r>
+              <w:t xml:space="preserve">istema </w:t>
+            </w:r>
+            <w:proofErr w:type="spellStart"/>
+            <w:r>
+              <w:t>Kuelap</w:t>
+            </w:r>
+            <w:proofErr w:type="spellEnd"/>
+            <w:r>
+              <w:t xml:space="preserve"> Travel, Operador de Pago</w:t>
+            </w:r>
+          </w:p>
+        </w:tc>
+      </w:tr>
+      <w:tr>
+        <w:trPr>
+          <w:cnfStyle w:val="000000100000" w:firstRow="0" w:lastRow="0" w:firstColumn="0" w:lastColumn="0" w:oddVBand="0" w:evenVBand="0" w:oddHBand="1" w:evenHBand="0" w:firstRowFirstColumn="0" w:firstRowLastColumn="0" w:lastRowFirstColumn="0" w:lastRowLastColumn="0"/>
+        </w:trPr>
+        <w:tc>
+          <w:tcPr>
+            <w:cnfStyle w:val="001000000000" w:firstRow="0" w:lastRow="0" w:firstColumn="1" w:lastColumn="0" w:oddVBand="0" w:evenVBand="0" w:oddHBand="0" w:evenHBand="0" w:firstRowFirstColumn="0" w:firstRowLastColumn="0" w:lastRowFirstColumn="0" w:lastRowLastColumn="0"/>
+            <w:tcW w:w="2547" w:type="dxa"/>
+          </w:tcPr>
+          <w:p>
+            <w:pPr>
+              <w:ind w:firstLine="0"/>
+            </w:pPr>
+            <w:r>
+              <w:t>Precondiciones</w:t>
+            </w:r>
+          </w:p>
+        </w:tc>
+        <w:tc>
+          <w:tcPr>
+            <w:tcW w:w="5947" w:type="dxa"/>
+          </w:tcPr>
+          <w:p>
+            <w:pPr>
+              <w:ind w:firstLine="0"/>
+              <w:cnfStyle w:val="000000100000" w:firstRow="0" w:lastRow="0" w:firstColumn="0" w:lastColumn="0" w:oddVBand="0" w:evenVBand="0" w:oddHBand="1" w:evenHBand="0" w:firstRowFirstColumn="0" w:firstRowLastColumn="0" w:lastRowFirstColumn="0" w:lastRowLastColumn="0"/>
+            </w:pPr>
+            <w:r>
+              <w:t>Debe existir una reserva con estado "Pendiente de pago" asociada al turista autenticado</w:t>
+            </w:r>
+          </w:p>
+        </w:tc>
+      </w:tr>
+      <w:tr>
+        <w:tc>
+          <w:tcPr>
+            <w:cnfStyle w:val="001000000000" w:firstRow="0" w:lastRow="0" w:firstColumn="1" w:lastColumn="0" w:oddVBand="0" w:evenVBand="0" w:oddHBand="0" w:evenHBand="0" w:firstRowFirstColumn="0" w:firstRowLastColumn="0" w:lastRowFirstColumn="0" w:lastRowLastColumn="0"/>
+            <w:tcW w:w="2547" w:type="dxa"/>
+          </w:tcPr>
+          <w:p>
+            <w:pPr>
+              <w:ind w:firstLine="0"/>
+            </w:pPr>
+            <w:r>
+              <w:t>Flujo principal</w:t>
+            </w:r>
+          </w:p>
+        </w:tc>
+        <w:tc>
+          <w:tcPr>
+            <w:tcW w:w="5947" w:type="dxa"/>
+          </w:tcPr>
+          <w:p>
+            <w:pPr>
+              <w:ind w:firstLine="0"/>
+              <w:cnfStyle w:val="000000000000" w:firstRow="0" w:lastRow="0" w:firstColumn="0" w:lastColumn="0" w:oddVBand="0" w:evenVBand="0" w:oddHBand="0" w:evenHBand="0" w:firstRowFirstColumn="0" w:firstRowLastColumn="0" w:lastRowFirstColumn="0" w:lastRowLastColumn="0"/>
+            </w:pPr>
+            <w:r>
+              <w:t>1. El sistema presenta un resumen de la reserva (paquete, precio total, cantidad de personas)</w:t>
+            </w:r>
+          </w:p>
+          <w:p>
+            <w:pPr>
+              <w:ind w:firstLine="0"/>
+              <w:cnfStyle w:val="000000000000" w:firstRow="0" w:lastRow="0" w:firstColumn="0" w:lastColumn="0" w:oddVBand="0" w:evenVBand="0" w:oddHBand="0" w:evenHBand="0" w:firstRowFirstColumn="0" w:firstRowLastColumn="0" w:lastRowFirstColumn="0" w:lastRowLastColumn="0"/>
+            </w:pPr>
+            <w:r>
+              <w:t>2. El turista selecciona el método de pago (tarjeta de crédito/débito)</w:t>
+            </w:r>
+          </w:p>
+          <w:p>
+            <w:pPr>
+              <w:ind w:firstLine="0"/>
+              <w:cnfStyle w:val="000000000000" w:firstRow="0" w:lastRow="0" w:firstColumn="0" w:lastColumn="0" w:oddVBand="0" w:evenVBand="0" w:oddHBand="0" w:evenHBand="0" w:firstRowFirstColumn="0" w:firstRowLastColumn="0" w:lastRowFirstColumn="0" w:lastRowLastColumn="0"/>
+            </w:pPr>
+            <w:r>
+              <w:t>3. El turista ingresa los datos de pago (número de tarjeta, CVV, fecha de vencimiento)</w:t>
+            </w:r>
+          </w:p>
+          <w:p>
+            <w:pPr>
+              <w:ind w:firstLine="0"/>
+              <w:cnfStyle w:val="000000000000" w:firstRow="0" w:lastRow="0" w:firstColumn="0" w:lastColumn="0" w:oddVBand="0" w:evenVBand="0" w:oddHBand="0" w:evenHBand="0" w:firstRowFirstColumn="0" w:firstRowLastColumn="0" w:lastRowFirstColumn="0" w:lastRowLastColumn="0"/>
+            </w:pPr>
+            <w:r>
+              <w:t>4. El sistema valida los datos mediante el operador de pago</w:t>
+            </w:r>
+          </w:p>
+          <w:p>
+            <w:pPr>
+              <w:ind w:firstLine="0"/>
+              <w:cnfStyle w:val="000000000000" w:firstRow="0" w:lastRow="0" w:firstColumn="0" w:lastColumn="0" w:oddVBand="0" w:evenVBand="0" w:oddHBand="0" w:evenHBand="0" w:firstRowFirstColumn="0" w:firstRowLastColumn="0" w:lastRowFirstColumn="0" w:lastRowLastColumn="0"/>
+            </w:pPr>
+            <w:r>
+              <w:t>5. El operador de pago procesa la transacción</w:t>
+            </w:r>
+          </w:p>
+          <w:p>
+            <w:pPr>
+              <w:ind w:firstLine="0"/>
+              <w:cnfStyle w:val="000000000000" w:firstRow="0" w:lastRow="0" w:firstColumn="0" w:lastColumn="0" w:oddVBand="0" w:evenVBand="0" w:oddHBand="0" w:evenHBand="0" w:firstRowFirstColumn="0" w:firstRowLastColumn="0" w:lastRowFirstColumn="0" w:lastRowLastColumn="0"/>
+            </w:pPr>
+            <w:r>
+              <w:t>6. El sistema recibe la confirmación del pago</w:t>
+            </w:r>
+          </w:p>
+          <w:p>
+            <w:pPr>
+              <w:ind w:firstLine="0"/>
+              <w:cnfStyle w:val="000000000000" w:firstRow="0" w:lastRow="0" w:firstColumn="0" w:lastColumn="0" w:oddVBand="0" w:evenVBand="0" w:oddHBand="0" w:evenHBand="0" w:firstRowFirstColumn="0" w:firstRowLastColumn="0" w:lastRowFirstColumn="0" w:lastRowLastColumn="0"/>
+            </w:pPr>
+            <w:r>
+              <w:t>7. El sistema actualiza el estado de la reserva a "Confirmada"</w:t>
+            </w:r>
+          </w:p>
+          <w:p>
+            <w:pPr>
+              <w:ind w:firstLine="0"/>
+              <w:cnfStyle w:val="000000000000" w:firstRow="0" w:lastRow="0" w:firstColumn="0" w:lastColumn="0" w:oddVBand="0" w:evenVBand="0" w:oddHBand="0" w:evenHBand="0" w:firstRowFirstColumn="0" w:firstRowLastColumn="0" w:lastRowFirstColumn="0" w:lastRowLastColumn="0"/>
+            </w:pPr>
+            <w:r>
+              <w:t>8. El sistema genera un comprobante digital</w:t>
+            </w:r>
+          </w:p>
+          <w:p>
+            <w:pPr>
+              <w:ind w:firstLine="0"/>
+              <w:cnfStyle w:val="000000000000" w:firstRow="0" w:lastRow="0" w:firstColumn="0" w:lastColumn="0" w:oddVBand="0" w:evenVBand="0" w:oddHBand="0" w:evenHBand="0" w:firstRowFirstColumn="0" w:firstRowLastColumn="0" w:lastRowFirstColumn="0" w:lastRowLastColumn="0"/>
+            </w:pPr>
+            <w:r>
+              <w:t>9. El sistema envía una notificación de confirmación al correo del turista</w:t>
+            </w:r>
+          </w:p>
+        </w:tc>
+      </w:tr>
+      <w:tr>
+        <w:trPr>
+          <w:cnfStyle w:val="000000100000" w:firstRow="0" w:lastRow="0" w:firstColumn="0" w:lastColumn="0" w:oddVBand="0" w:evenVBand="0" w:oddHBand="1" w:evenHBand="0" w:firstRowFirstColumn="0" w:firstRowLastColumn="0" w:lastRowFirstColumn="0" w:lastRowLastColumn="0"/>
+        </w:trPr>
+        <w:tc>
+          <w:tcPr>
+            <w:cnfStyle w:val="001000000000" w:firstRow="0" w:lastRow="0" w:firstColumn="1" w:lastColumn="0" w:oddVBand="0" w:evenVBand="0" w:oddHBand="0" w:evenHBand="0" w:firstRowFirstColumn="0" w:firstRowLastColumn="0" w:lastRowFirstColumn="0" w:lastRowLastColumn="0"/>
+            <w:tcW w:w="2547" w:type="dxa"/>
+          </w:tcPr>
+          <w:p>
+            <w:pPr>
+              <w:ind w:firstLine="0"/>
+            </w:pPr>
+            <w:r>
+              <w:t>Flujos alternativos</w:t>
+            </w:r>
+          </w:p>
+        </w:tc>
+        <w:tc>
+          <w:tcPr>
+            <w:tcW w:w="5947" w:type="dxa"/>
+          </w:tcPr>
+          <w:p>
+            <w:pPr>
+              <w:ind w:firstLine="0"/>
+              <w:cnfStyle w:val="000000100000" w:firstRow="0" w:lastRow="0" w:firstColumn="0" w:lastColumn="0" w:oddVBand="0" w:evenVBand="0" w:oddHBand="1" w:evenHBand="0" w:firstRowFirstColumn="0" w:firstRowLastColumn="0" w:lastRowFirstColumn="0" w:lastRowLastColumn="0"/>
+              <w:rPr>
+                <w:b/>
+                <w:bCs/>
+              </w:rPr>
+            </w:pPr>
+            <w:r>
+              <w:rPr>
+                <w:b/>
+                <w:bCs/>
+              </w:rPr>
+              <w:t>FA1 - Pago rechazado:</w:t>
+            </w:r>
+          </w:p>
+          <w:p>
+            <w:pPr>
+              <w:ind w:firstLine="0"/>
+              <w:cnfStyle w:val="000000100000" w:firstRow="0" w:lastRow="0" w:firstColumn="0" w:lastColumn="0" w:oddVBand="0" w:evenVBand="0" w:oddHBand="1" w:evenHBand="0" w:firstRowFirstColumn="0" w:firstRowLastColumn="0" w:lastRowFirstColumn="0" w:lastRowLastColumn="0"/>
+            </w:pPr>
+            <w:r>
+              <w:t>En el paso 5, si el operador de pago rechaza la transacción, el sistema muestra un mensaje de error y permite reintentar</w:t>
+            </w:r>
+          </w:p>
+          <w:p>
+            <w:pPr>
+              <w:ind w:firstLine="0"/>
+              <w:cnfStyle w:val="000000100000" w:firstRow="0" w:lastRow="0" w:firstColumn="0" w:lastColumn="0" w:oddVBand="0" w:evenVBand="0" w:oddHBand="1" w:evenHBand="0" w:firstRowFirstColumn="0" w:firstRowLastColumn="0" w:lastRowFirstColumn="0" w:lastRowLastColumn="0"/>
+            </w:pPr>
+            <w:r>
+              <w:rPr>
+                <w:b/>
+                <w:bCs/>
+              </w:rPr>
+              <w:t>FA2 - Datos de pago inválidos:</w:t>
+            </w:r>
+          </w:p>
+          <w:p>
+            <w:pPr>
+              <w:ind w:firstLine="0"/>
+              <w:cnfStyle w:val="000000100000" w:firstRow="0" w:lastRow="0" w:firstColumn="0" w:lastColumn="0" w:oddVBand="0" w:evenVBand="0" w:oddHBand="1" w:evenHBand="0" w:firstRowFirstColumn="0" w:firstRowLastColumn="0" w:lastRowFirstColumn="0" w:lastRowLastColumn="0"/>
+            </w:pPr>
+            <w:r>
+              <w:t>En el paso 4, si los datos son inválidos, el sistema solicita correcciones al turista</w:t>
+            </w:r>
+          </w:p>
+        </w:tc>
+      </w:tr>
+      <w:tr>
+        <w:tc>
+          <w:tcPr>
+            <w:cnfStyle w:val="001000000000" w:firstRow="0" w:lastRow="0" w:firstColumn="1" w:lastColumn="0" w:oddVBand="0" w:evenVBand="0" w:oddHBand="0" w:evenHBand="0" w:firstRowFirstColumn="0" w:firstRowLastColumn="0" w:lastRowFirstColumn="0" w:lastRowLastColumn="0"/>
+            <w:tcW w:w="2547" w:type="dxa"/>
+          </w:tcPr>
+          <w:p>
+            <w:pPr>
+              <w:ind w:firstLine="0"/>
+            </w:pPr>
+            <w:r>
+              <w:t>Postcondiciones</w:t>
+            </w:r>
+          </w:p>
+        </w:tc>
+        <w:tc>
+          <w:tcPr>
+            <w:tcW w:w="5947" w:type="dxa"/>
+          </w:tcPr>
+          <w:p>
+            <w:pPr>
+              <w:ind w:firstLine="0"/>
+              <w:cnfStyle w:val="000000000000" w:firstRow="0" w:lastRow="0" w:firstColumn="0" w:lastColumn="0" w:oddVBand="0" w:evenVBand="0" w:oddHBand="0" w:evenHBand="0" w:firstRowFirstColumn="0" w:firstRowLastColumn="0" w:lastRowFirstColumn="0" w:lastRowLastColumn="0"/>
+            </w:pPr>
+            <w:r>
+              <w:t>El pago queda registrado en el historial, la reserva cambia a estado "Confirmada" y se emite comprobante</w:t>
+            </w:r>
+          </w:p>
+        </w:tc>
+      </w:tr>
+      <w:tr>
+        <w:trPr>
+          <w:cnfStyle w:val="000000100000" w:firstRow="0" w:lastRow="0" w:firstColumn="0" w:lastColumn="0" w:oddVBand="0" w:evenVBand="0" w:oddHBand="1" w:evenHBand="0" w:firstRowFirstColumn="0" w:firstRowLastColumn="0" w:lastRowFirstColumn="0" w:lastRowLastColumn="0"/>
+        </w:trPr>
+        <w:tc>
+          <w:tcPr>
+            <w:cnfStyle w:val="001000000000" w:firstRow="0" w:lastRow="0" w:firstColumn="1" w:lastColumn="0" w:oddVBand="0" w:evenVBand="0" w:oddHBand="0" w:evenHBand="0" w:firstRowFirstColumn="0" w:firstRowLastColumn="0" w:lastRowFirstColumn="0" w:lastRowLastColumn="0"/>
+            <w:tcW w:w="2547" w:type="dxa"/>
+          </w:tcPr>
+          <w:p>
+            <w:pPr>
+              <w:ind w:firstLine="0"/>
+            </w:pPr>
+            <w:r>
+              <w:lastRenderedPageBreak/>
+              <w:t>Notas</w:t>
+            </w:r>
+          </w:p>
+        </w:tc>
+        <w:tc>
+          <w:tcPr>
+            <w:tcW w:w="5947" w:type="dxa"/>
+          </w:tcPr>
+          <w:p>
+            <w:pPr>
+              <w:ind w:firstLine="0"/>
+              <w:cnfStyle w:val="000000100000" w:firstRow="0" w:lastRow="0" w:firstColumn="0" w:lastColumn="0" w:oddVBand="0" w:evenVBand="0" w:oddHBand="1" w:evenHBand="0" w:firstRowFirstColumn="0" w:firstRowLastColumn="0" w:lastRowFirstColumn="0" w:lastRowLastColumn="0"/>
+            </w:pPr>
+            <w:r>
+              <w:t>Los datos de pago deben transmitirse mediante HTTPS. El sistema debe cumplir con estándares PCI-DSS</w:t>
+            </w:r>
+          </w:p>
+        </w:tc>
+      </w:tr>
+    </w:tbl>
+    <w:p>
+      <w:r>
+        <w:rPr>
+          <w:i/>
+          <w:iCs/>
+        </w:rPr>
+        <w:t>Nota.</w:t>
+      </w:r>
+      <w:r>
+        <w:t xml:space="preserve"> Elaboración propia</w:t>
+      </w:r>
+    </w:p>
+    <w:p/>
+    <w:p>
+      <w:pPr>
+        <w:pStyle w:val="Ttulo3"/>
+      </w:pPr>
+      <w:r>
+        <w:t>3.7.3. Caso de Uso 3: Recibir Notificación de Confirmación y Recordatorio</w:t>
+      </w:r>
+    </w:p>
+    <w:p>
+      <w:r>
+        <w:rPr>
+          <w:b/>
+          <w:bCs/>
+        </w:rPr>
+        <w:t>Tabla 9</w:t>
+      </w:r>
+    </w:p>
+    <w:p>
+      <w:r>
+        <w:rPr>
+          <w:i/>
+          <w:iCs/>
+        </w:rPr>
+        <w:t>Especificación del caso de uso: Recibir Notificación de Confirmación y Recordatorio</w:t>
+      </w:r>
+    </w:p>
+    <w:tbl>
+      <w:tblPr>
+        <w:tblStyle w:val="Tablanormal2"/>
+        <w:tblW w:w="0" w:type="auto"/>
+        <w:tblLook w:val="04A0" w:firstRow="1" w:lastRow="0" w:firstColumn="1" w:lastColumn="0" w:noHBand="0" w:noVBand="1"/>
+      </w:tblPr>
+      <w:tblGrid>
+        <w:gridCol w:w="2547"/>
+        <w:gridCol w:w="5947"/>
+      </w:tblGrid>
+      <w:tr>
+        <w:trPr>
+          <w:cnfStyle w:val="100000000000" w:firstRow="1" w:lastRow="0" w:firstColumn="0" w:lastColumn="0" w:oddVBand="0" w:evenVBand="0" w:oddHBand="0" w:evenHBand="0" w:firstRowFirstColumn="0" w:firstRowLastColumn="0" w:lastRowFirstColumn="0" w:lastRowLastColumn="0"/>
+        </w:trPr>
+        <w:tc>
+          <w:tcPr>
+            <w:cnfStyle w:val="001000000000" w:firstRow="0" w:lastRow="0" w:firstColumn="1" w:lastColumn="0" w:oddVBand="0" w:evenVBand="0" w:oddHBand="0" w:evenHBand="0" w:firstRowFirstColumn="0" w:firstRowLastColumn="0" w:lastRowFirstColumn="0" w:lastRowLastColumn="0"/>
+            <w:tcW w:w="2547" w:type="dxa"/>
+          </w:tcPr>
+          <w:p>
+            <w:pPr>
+              <w:ind w:firstLine="0"/>
+            </w:pPr>
+            <w:r>
+              <w:t>Atributo</w:t>
+            </w:r>
+          </w:p>
+        </w:tc>
+        <w:tc>
+          <w:tcPr>
+            <w:tcW w:w="5947" w:type="dxa"/>
+          </w:tcPr>
+          <w:p>
+            <w:pPr>
+              <w:ind w:firstLine="0"/>
+              <w:cnfStyle w:val="100000000000" w:firstRow="1" w:lastRow="0" w:firstColumn="0" w:lastColumn="0" w:oddVBand="0" w:evenVBand="0" w:oddHBand="0" w:evenHBand="0" w:firstRowFirstColumn="0" w:firstRowLastColumn="0" w:lastRowFirstColumn="0" w:lastRowLastColumn="0"/>
+            </w:pPr>
+            <w:r>
+              <w:t>Descripción</w:t>
+            </w:r>
+          </w:p>
+        </w:tc>
+      </w:tr>
+      <w:tr>
+        <w:trPr>
+          <w:cnfStyle w:val="000000100000" w:firstRow="0" w:lastRow="0" w:firstColumn="0" w:lastColumn="0" w:oddVBand="0" w:evenVBand="0" w:oddHBand="1" w:evenHBand="0" w:firstRowFirstColumn="0" w:firstRowLastColumn="0" w:lastRowFirstColumn="0" w:lastRowLastColumn="0"/>
+        </w:trPr>
+        <w:tc>
+          <w:tcPr>
+            <w:cnfStyle w:val="001000000000" w:firstRow="0" w:lastRow="0" w:firstColumn="1" w:lastColumn="0" w:oddVBand="0" w:evenVBand="0" w:oddHBand="0" w:evenHBand="0" w:firstRowFirstColumn="0" w:firstRowLastColumn="0" w:lastRowFirstColumn="0" w:lastRowLastColumn="0"/>
+            <w:tcW w:w="2547" w:type="dxa"/>
+          </w:tcPr>
+          <w:p>
+            <w:pPr>
+              <w:ind w:firstLine="0"/>
+            </w:pPr>
+            <w:r>
+              <w:t>Identificador</w:t>
+            </w:r>
+          </w:p>
+        </w:tc>
+        <w:tc>
+          <w:tcPr>
+            <w:tcW w:w="5947" w:type="dxa"/>
+          </w:tcPr>
+          <w:p>
+            <w:pPr>
+              <w:ind w:firstLine="0"/>
+              <w:cnfStyle w:val="000000100000" w:firstRow="0" w:lastRow="0" w:firstColumn="0" w:lastColumn="0" w:oddVBand="0" w:evenVBand="0" w:oddHBand="1" w:evenHBand="0" w:firstRowFirstColumn="0" w:firstRowLastColumn="0" w:lastRowFirstColumn="0" w:lastRowLastColumn="0"/>
+            </w:pPr>
+            <w:r>
+              <w:t>CU-0</w:t>
+            </w:r>
+            <w:r>
+              <w:t>3</w:t>
+            </w:r>
+          </w:p>
+        </w:tc>
+      </w:tr>
+      <w:tr>
+        <w:tc>
+          <w:tcPr>
+            <w:cnfStyle w:val="001000000000" w:firstRow="0" w:lastRow="0" w:firstColumn="1" w:lastColumn="0" w:oddVBand="0" w:evenVBand="0" w:oddHBand="0" w:evenHBand="0" w:firstRowFirstColumn="0" w:firstRowLastColumn="0" w:lastRowFirstColumn="0" w:lastRowLastColumn="0"/>
+            <w:tcW w:w="2547" w:type="dxa"/>
+          </w:tcPr>
+          <w:p>
+            <w:pPr>
+              <w:ind w:firstLine="0"/>
+            </w:pPr>
+            <w:r>
+              <w:t>Nombre</w:t>
+            </w:r>
+          </w:p>
+        </w:tc>
+        <w:tc>
+          <w:tcPr>
+            <w:tcW w:w="5947" w:type="dxa"/>
+          </w:tcPr>
+          <w:p>
+            <w:pPr>
+              <w:ind w:firstLine="0"/>
+              <w:cnfStyle w:val="000000000000" w:firstRow="0" w:lastRow="0" w:firstColumn="0" w:lastColumn="0" w:oddVBand="0" w:evenVBand="0" w:oddHBand="0" w:evenHBand="0" w:firstRowFirstColumn="0" w:firstRowLastColumn="0" w:lastRowFirstColumn="0" w:lastRowLastColumn="0"/>
+            </w:pPr>
+            <w:r>
+              <w:t>Recibir Notificación de Confirmación y Recordatorio de Viaje</w:t>
+            </w:r>
+          </w:p>
+        </w:tc>
+      </w:tr>
+      <w:tr>
+        <w:trPr>
+          <w:cnfStyle w:val="000000100000" w:firstRow="0" w:lastRow="0" w:firstColumn="0" w:lastColumn="0" w:oddVBand="0" w:evenVBand="0" w:oddHBand="1" w:evenHBand="0" w:firstRowFirstColumn="0" w:firstRowLastColumn="0" w:lastRowFirstColumn="0" w:lastRowLastColumn="0"/>
+        </w:trPr>
+        <w:tc>
+          <w:tcPr>
+            <w:cnfStyle w:val="001000000000" w:firstRow="0" w:lastRow="0" w:firstColumn="1" w:lastColumn="0" w:oddVBand="0" w:evenVBand="0" w:oddHBand="0" w:evenHBand="0" w:firstRowFirstColumn="0" w:firstRowLastColumn="0" w:lastRowFirstColumn="0" w:lastRowLastColumn="0"/>
+            <w:tcW w:w="2547" w:type="dxa"/>
+          </w:tcPr>
+          <w:p>
+            <w:pPr>
+              <w:ind w:firstLine="0"/>
+            </w:pPr>
+            <w:r>
+              <w:t>Actores principales</w:t>
+            </w:r>
+          </w:p>
+        </w:tc>
+        <w:tc>
+          <w:tcPr>
+            <w:tcW w:w="5947" w:type="dxa"/>
+          </w:tcPr>
+          <w:p>
+            <w:pPr>
+              <w:ind w:firstLine="0"/>
+              <w:cnfStyle w:val="000000100000" w:firstRow="0" w:lastRow="0" w:firstColumn="0" w:lastColumn="0" w:oddVBand="0" w:evenVBand="0" w:oddHBand="1" w:evenHBand="0" w:firstRowFirstColumn="0" w:firstRowLastColumn="0" w:lastRowFirstColumn="0" w:lastRowLastColumn="0"/>
+            </w:pPr>
+            <w:r>
+              <w:t>Turista</w:t>
+            </w:r>
+          </w:p>
+        </w:tc>
+      </w:tr>
+      <w:tr>
+        <w:tc>
+          <w:tcPr>
+            <w:cnfStyle w:val="001000000000" w:firstRow="0" w:lastRow="0" w:firstColumn="1" w:lastColumn="0" w:oddVBand="0" w:evenVBand="0" w:oddHBand="0" w:evenHBand="0" w:firstRowFirstColumn="0" w:firstRowLastColumn="0" w:lastRowFirstColumn="0" w:lastRowLastColumn="0"/>
+            <w:tcW w:w="2547" w:type="dxa"/>
+          </w:tcPr>
+          <w:p>
+            <w:pPr>
+              <w:ind w:firstLine="0"/>
+            </w:pPr>
+            <w:r>
+              <w:t>Actores secundarios</w:t>
+            </w:r>
+          </w:p>
+        </w:tc>
+        <w:tc>
+          <w:tcPr>
+            <w:tcW w:w="5947" w:type="dxa"/>
+          </w:tcPr>
+          <w:p>
+            <w:pPr>
+              <w:ind w:firstLine="0"/>
+              <w:cnfStyle w:val="000000000000" w:firstRow="0" w:lastRow="0" w:firstColumn="0" w:lastColumn="0" w:oddVBand="0" w:evenVBand="0" w:oddHBand="0" w:evenHBand="0" w:firstRowFirstColumn="0" w:firstRowLastColumn="0" w:lastRowFirstColumn="0" w:lastRowLastColumn="0"/>
+            </w:pPr>
+            <w:r>
+              <w:t xml:space="preserve">Sistema </w:t>
+            </w:r>
+            <w:proofErr w:type="spellStart"/>
+            <w:r>
+              <w:t>Kuelap</w:t>
+            </w:r>
+            <w:proofErr w:type="spellEnd"/>
+            <w:r>
+              <w:t xml:space="preserve"> Travel, Servicio de Correo</w:t>
+            </w:r>
+          </w:p>
+        </w:tc>
+      </w:tr>
+      <w:tr>
+        <w:trPr>
+          <w:cnfStyle w:val="000000100000" w:firstRow="0" w:lastRow="0" w:firstColumn="0" w:lastColumn="0" w:oddVBand="0" w:evenVBand="0" w:oddHBand="1" w:evenHBand="0" w:firstRowFirstColumn="0" w:firstRowLastColumn="0" w:lastRowFirstColumn="0" w:lastRowLastColumn="0"/>
+        </w:trPr>
+        <w:tc>
+          <w:tcPr>
+            <w:cnfStyle w:val="001000000000" w:firstRow="0" w:lastRow="0" w:firstColumn="1" w:lastColumn="0" w:oddVBand="0" w:evenVBand="0" w:oddHBand="0" w:evenHBand="0" w:firstRowFirstColumn="0" w:firstRowLastColumn="0" w:lastRowFirstColumn="0" w:lastRowLastColumn="0"/>
+            <w:tcW w:w="2547" w:type="dxa"/>
+          </w:tcPr>
+          <w:p>
+            <w:pPr>
+              <w:ind w:firstLine="0"/>
+            </w:pPr>
+            <w:r>
+              <w:t>Precondiciones</w:t>
+            </w:r>
+          </w:p>
+        </w:tc>
+        <w:tc>
+          <w:tcPr>
+            <w:tcW w:w="5947" w:type="dxa"/>
+          </w:tcPr>
+          <w:p>
+            <w:pPr>
+              <w:ind w:firstLine="0"/>
+              <w:cnfStyle w:val="000000100000" w:firstRow="0" w:lastRow="0" w:firstColumn="0" w:lastColumn="0" w:oddVBand="0" w:evenVBand="0" w:oddHBand="1" w:evenHBand="0" w:firstRowFirstColumn="0" w:firstRowLastColumn="0" w:lastRowFirstColumn="0" w:lastRowLastColumn="0"/>
+            </w:pPr>
+            <w:r>
+              <w:t>Debe existir una reserva confirmada con pago procesado</w:t>
+            </w:r>
+          </w:p>
+        </w:tc>
+      </w:tr>
+      <w:tr>
+        <w:tc>
+          <w:tcPr>
+            <w:cnfStyle w:val="001000000000" w:firstRow="0" w:lastRow="0" w:firstColumn="1" w:lastColumn="0" w:oddVBand="0" w:evenVBand="0" w:oddHBand="0" w:evenHBand="0" w:firstRowFirstColumn="0" w:firstRowLastColumn="0" w:lastRowFirstColumn="0" w:lastRowLastColumn="0"/>
+            <w:tcW w:w="2547" w:type="dxa"/>
+          </w:tcPr>
+          <w:p>
+            <w:pPr>
+              <w:ind w:firstLine="0"/>
+            </w:pPr>
+            <w:r>
+              <w:t>Flujo principal</w:t>
+            </w:r>
+            <w:r>
+              <w:t xml:space="preserve"> – Notificación de confirmación</w:t>
+            </w:r>
+          </w:p>
+        </w:tc>
+        <w:tc>
+          <w:tcPr>
+            <w:tcW w:w="5947" w:type="dxa"/>
+          </w:tcPr>
+          <w:p>
+            <w:pPr>
+              <w:ind w:firstLine="0"/>
+              <w:cnfStyle w:val="000000000000" w:firstRow="0" w:lastRow="0" w:firstColumn="0" w:lastColumn="0" w:oddVBand="0" w:evenVBand="0" w:oddHBand="0" w:evenHBand="0" w:firstRowFirstColumn="0" w:firstRowLastColumn="0" w:lastRowFirstColumn="0" w:lastRowLastColumn="0"/>
+            </w:pPr>
+            <w:r>
+              <w:t>1. El sistema detecta que un pago ha sido confirmado (CU-02)</w:t>
+            </w:r>
+          </w:p>
+          <w:p>
+            <w:pPr>
+              <w:ind w:firstLine="0"/>
+              <w:cnfStyle w:val="000000000000" w:firstRow="0" w:lastRow="0" w:firstColumn="0" w:lastColumn="0" w:oddVBand="0" w:evenVBand="0" w:oddHBand="0" w:evenHBand="0" w:firstRowFirstColumn="0" w:firstRowLastColumn="0" w:lastRowFirstColumn="0" w:lastRowLastColumn="0"/>
+            </w:pPr>
+            <w:r>
+              <w:t>2. El sistema genera un correo de confirmación con los detalles de la reserva</w:t>
+            </w:r>
+          </w:p>
+          <w:p>
+            <w:pPr>
+              <w:ind w:firstLine="0"/>
+              <w:cnfStyle w:val="000000000000" w:firstRow="0" w:lastRow="0" w:firstColumn="0" w:lastColumn="0" w:oddVBand="0" w:evenVBand="0" w:oddHBand="0" w:evenHBand="0" w:firstRowFirstColumn="0" w:firstRowLastColumn="0" w:lastRowFirstColumn="0" w:lastRowLastColumn="0"/>
+            </w:pPr>
+            <w:r>
+              <w:t>3. El sistema incluye el comprobante digital en PDF adjunto</w:t>
+            </w:r>
+          </w:p>
+          <w:p>
+            <w:pPr>
+              <w:ind w:firstLine="0"/>
+              <w:cnfStyle w:val="000000000000" w:firstRow="0" w:lastRow="0" w:firstColumn="0" w:lastColumn="0" w:oddVBand="0" w:evenVBand="0" w:oddHBand="0" w:evenHBand="0" w:firstRowFirstColumn="0" w:firstRowLastColumn="0" w:lastRowFirstColumn="0" w:lastRowLastColumn="0"/>
+            </w:pPr>
+            <w:r>
+              <w:t>4. El sistema envía el correo al turista</w:t>
+            </w:r>
+          </w:p>
+          <w:p>
+            <w:pPr>
+              <w:ind w:firstLine="0"/>
+              <w:cnfStyle w:val="000000000000" w:firstRow="0" w:lastRow="0" w:firstColumn="0" w:lastColumn="0" w:oddVBand="0" w:evenVBand="0" w:oddHBand="0" w:evenHBand="0" w:firstRowFirstColumn="0" w:firstRowLastColumn="0" w:lastRowFirstColumn="0" w:lastRowLastColumn="0"/>
+            </w:pPr>
+            <w:r>
+              <w:t>5. El turista recibe la notificación de confirmación</w:t>
+            </w:r>
+          </w:p>
+        </w:tc>
+      </w:tr>
+      <w:tr>
+        <w:trPr>
+          <w:cnfStyle w:val="000000100000" w:firstRow="0" w:lastRow="0" w:firstColumn="0" w:lastColumn="0" w:oddVBand="0" w:evenVBand="0" w:oddHBand="1" w:evenHBand="0" w:firstRowFirstColumn="0" w:firstRowLastColumn="0" w:lastRowFirstColumn="0" w:lastRowLastColumn="0"/>
+        </w:trPr>
+        <w:tc>
+          <w:tcPr>
+            <w:cnfStyle w:val="001000000000" w:firstRow="0" w:lastRow="0" w:firstColumn="1" w:lastColumn="0" w:oddVBand="0" w:evenVBand="0" w:oddHBand="0" w:evenHBand="0" w:firstRowFirstColumn="0" w:firstRowLastColumn="0" w:lastRowFirstColumn="0" w:lastRowLastColumn="0"/>
+            <w:tcW w:w="2547" w:type="dxa"/>
+          </w:tcPr>
+          <w:p>
+            <w:pPr>
+              <w:ind w:firstLine="0"/>
+            </w:pPr>
+            <w:r>
+              <w:t>Flujo</w:t>
+            </w:r>
+            <w:r>
+              <w:t xml:space="preserve"> principal – Recordatorio de viaje</w:t>
+            </w:r>
+          </w:p>
+        </w:tc>
+        <w:tc>
+          <w:tcPr>
+            <w:tcW w:w="5947" w:type="dxa"/>
+          </w:tcPr>
+          <w:p>
+            <w:pPr>
+              <w:ind w:firstLine="0"/>
+              <w:cnfStyle w:val="000000100000" w:firstRow="0" w:lastRow="0" w:firstColumn="0" w:lastColumn="0" w:oddVBand="0" w:evenVBand="0" w:oddHBand="1" w:evenHBand="0" w:firstRowFirstColumn="0" w:firstRowLastColumn="0" w:lastRowFirstColumn="0" w:lastRowLastColumn="0"/>
+            </w:pPr>
+            <w:r>
+              <w:t>1. El sistema detecta que un pago ha sido confirmado (CU-02)</w:t>
+            </w:r>
+          </w:p>
+          <w:p>
+            <w:pPr>
+              <w:ind w:firstLine="0"/>
+              <w:cnfStyle w:val="000000100000" w:firstRow="0" w:lastRow="0" w:firstColumn="0" w:lastColumn="0" w:oddVBand="0" w:evenVBand="0" w:oddHBand="1" w:evenHBand="0" w:firstRowFirstColumn="0" w:firstRowLastColumn="0" w:lastRowFirstColumn="0" w:lastRowLastColumn="0"/>
+            </w:pPr>
+            <w:r>
+              <w:t>2. El sistema genera un correo de confirmación con los detalles de la reserva</w:t>
+            </w:r>
+          </w:p>
+          <w:p>
+            <w:pPr>
+              <w:ind w:firstLine="0"/>
+              <w:cnfStyle w:val="000000100000" w:firstRow="0" w:lastRow="0" w:firstColumn="0" w:lastColumn="0" w:oddVBand="0" w:evenVBand="0" w:oddHBand="1" w:evenHBand="0" w:firstRowFirstColumn="0" w:firstRowLastColumn="0" w:lastRowFirstColumn="0" w:lastRowLastColumn="0"/>
+            </w:pPr>
+            <w:r>
+              <w:t>3. El sistema incluye el comprobante digital en PDF adjunto</w:t>
+            </w:r>
+          </w:p>
+          <w:p>
+            <w:pPr>
+              <w:ind w:firstLine="0"/>
+              <w:cnfStyle w:val="000000100000" w:firstRow="0" w:lastRow="0" w:firstColumn="0" w:lastColumn="0" w:oddVBand="0" w:evenVBand="0" w:oddHBand="1" w:evenHBand="0" w:firstRowFirstColumn="0" w:firstRowLastColumn="0" w:lastRowFirstColumn="0" w:lastRowLastColumn="0"/>
+            </w:pPr>
+            <w:r>
+              <w:t>4. El sistema envía el correo al turista</w:t>
+            </w:r>
+          </w:p>
+          <w:p>
+            <w:pPr>
+              <w:ind w:firstLine="0"/>
+              <w:cnfStyle w:val="000000100000" w:firstRow="0" w:lastRow="0" w:firstColumn="0" w:lastColumn="0" w:oddVBand="0" w:evenVBand="0" w:oddHBand="1" w:evenHBand="0" w:firstRowFirstColumn="0" w:firstRowLastColumn="0" w:lastRowFirstColumn="0" w:lastRowLastColumn="0"/>
+            </w:pPr>
+            <w:r>
+              <w:t>5. El turista recibe la notificación de confirmación</w:t>
+            </w:r>
+          </w:p>
+        </w:tc>
+      </w:tr>
+      <w:tr>
+        <w:tc>
+          <w:tcPr>
+            <w:cnfStyle w:val="001000000000" w:firstRow="0" w:lastRow="0" w:firstColumn="1" w:lastColumn="0" w:oddVBand="0" w:evenVBand="0" w:oddHBand="0" w:evenHBand="0" w:firstRowFirstColumn="0" w:firstRowLastColumn="0" w:lastRowFirstColumn="0" w:lastRowLastColumn="0"/>
+            <w:tcW w:w="2547" w:type="dxa"/>
+          </w:tcPr>
+          <w:p>
+            <w:pPr>
+              <w:ind w:firstLine="0"/>
+            </w:pPr>
+            <w:r>
+              <w:t>Flujos alternativos</w:t>
+            </w:r>
+          </w:p>
+        </w:tc>
+        <w:tc>
+          <w:tcPr>
+            <w:tcW w:w="5947" w:type="dxa"/>
+          </w:tcPr>
+          <w:p>
+            <w:pPr>
+              <w:ind w:firstLine="0"/>
+              <w:cnfStyle w:val="000000000000" w:firstRow="0" w:lastRow="0" w:firstColumn="0" w:lastColumn="0" w:oddVBand="0" w:evenVBand="0" w:oddHBand="0" w:evenHBand="0" w:firstRowFirstColumn="0" w:firstRowLastColumn="0" w:lastRowFirstColumn="0" w:lastRowLastColumn="0"/>
+              <w:rPr>
+                <w:b/>
+                <w:bCs/>
+              </w:rPr>
+            </w:pPr>
+            <w:r>
+              <w:rPr>
+                <w:b/>
+                <w:bCs/>
+              </w:rPr>
+              <w:t>FA1 - Correo inválido:</w:t>
+            </w:r>
+          </w:p>
+          <w:p>
+            <w:pPr>
+              <w:ind w:firstLine="0"/>
+              <w:cnfStyle w:val="000000000000" w:firstRow="0" w:lastRow="0" w:firstColumn="0" w:lastColumn="0" w:oddVBand="0" w:evenVBand="0" w:oddHBand="0" w:evenHBand="0" w:firstRowFirstColumn="0" w:firstRowLastColumn="0" w:lastRowFirstColumn="0" w:lastRowLastColumn="0"/>
+            </w:pPr>
+            <w:r>
+              <w:t>Si el correo registrado del turista es inválido, el sistema lo marca como "No entregado" y lo registra en bitácora</w:t>
+            </w:r>
+          </w:p>
+          <w:p>
+            <w:pPr>
+              <w:ind w:firstLine="0"/>
+              <w:cnfStyle w:val="000000000000" w:firstRow="0" w:lastRow="0" w:firstColumn="0" w:lastColumn="0" w:oddVBand="0" w:evenVBand="0" w:oddHBand="0" w:evenHBand="0" w:firstRowFirstColumn="0" w:firstRowLastColumn="0" w:lastRowFirstColumn="0" w:lastRowLastColumn="0"/>
+              <w:rPr>
+                <w:b/>
+                <w:bCs/>
+              </w:rPr>
+            </w:pPr>
+            <w:r>
+              <w:rPr>
+                <w:b/>
+                <w:bCs/>
+              </w:rPr>
+              <w:t>FA2 - Turista desactiva notificaciones:</w:t>
+            </w:r>
+          </w:p>
+          <w:p>
+            <w:pPr>
+              <w:ind w:firstLine="0"/>
+              <w:cnfStyle w:val="000000000000" w:firstRow="0" w:lastRow="0" w:firstColumn="0" w:lastColumn="0" w:oddVBand="0" w:evenVBand="0" w:oddHBand="0" w:evenHBand="0" w:firstRowFirstColumn="0" w:firstRowLastColumn="0" w:lastRowFirstColumn="0" w:lastRowLastColumn="0"/>
+            </w:pPr>
+            <w:r>
+              <w:lastRenderedPageBreak/>
+              <w:t>Si el turista desactiva notificaciones en su perfil, el sistema no envía recordatorios posteriores</w:t>
+            </w:r>
+          </w:p>
+        </w:tc>
+      </w:tr>
+      <w:tr>
+        <w:trPr>
+          <w:cnfStyle w:val="000000100000" w:firstRow="0" w:lastRow="0" w:firstColumn="0" w:lastColumn="0" w:oddVBand="0" w:evenVBand="0" w:oddHBand="1" w:evenHBand="0" w:firstRowFirstColumn="0" w:firstRowLastColumn="0" w:lastRowFirstColumn="0" w:lastRowLastColumn="0"/>
+        </w:trPr>
+        <w:tc>
+          <w:tcPr>
+            <w:cnfStyle w:val="001000000000" w:firstRow="0" w:lastRow="0" w:firstColumn="1" w:lastColumn="0" w:oddVBand="0" w:evenVBand="0" w:oddHBand="0" w:evenHBand="0" w:firstRowFirstColumn="0" w:firstRowLastColumn="0" w:lastRowFirstColumn="0" w:lastRowLastColumn="0"/>
+            <w:tcW w:w="2547" w:type="dxa"/>
+          </w:tcPr>
+          <w:p>
+            <w:pPr>
+              <w:ind w:firstLine="0"/>
+            </w:pPr>
+            <w:r>
+              <w:lastRenderedPageBreak/>
+              <w:t>Postcondiciones</w:t>
+            </w:r>
+          </w:p>
+        </w:tc>
+        <w:tc>
+          <w:tcPr>
+            <w:tcW w:w="5947" w:type="dxa"/>
+          </w:tcPr>
+          <w:p>
+            <w:pPr>
+              <w:ind w:firstLine="0"/>
+              <w:cnfStyle w:val="000000100000" w:firstRow="0" w:lastRow="0" w:firstColumn="0" w:lastColumn="0" w:oddVBand="0" w:evenVBand="0" w:oddHBand="1" w:evenHBand="0" w:firstRowFirstColumn="0" w:firstRowLastColumn="0" w:lastRowFirstColumn="0" w:lastRowLastColumn="0"/>
+            </w:pPr>
+            <w:r>
+              <w:t>La notificación es registrada como "Enviada" o "No entregada" en el sistema</w:t>
+            </w:r>
+          </w:p>
+        </w:tc>
+      </w:tr>
+      <w:tr>
+        <w:tc>
+          <w:tcPr>
+            <w:cnfStyle w:val="001000000000" w:firstRow="0" w:lastRow="0" w:firstColumn="1" w:lastColumn="0" w:oddVBand="0" w:evenVBand="0" w:oddHBand="0" w:evenHBand="0" w:firstRowFirstColumn="0" w:firstRowLastColumn="0" w:lastRowFirstColumn="0" w:lastRowLastColumn="0"/>
+            <w:tcW w:w="2547" w:type="dxa"/>
+          </w:tcPr>
+          <w:p>
+            <w:pPr>
+              <w:ind w:firstLine="0"/>
+            </w:pPr>
+            <w:r>
+              <w:t>Notas</w:t>
+            </w:r>
+          </w:p>
+        </w:tc>
+        <w:tc>
+          <w:tcPr>
+            <w:tcW w:w="5947" w:type="dxa"/>
+          </w:tcPr>
+          <w:p>
+            <w:pPr>
+              <w:ind w:firstLine="0"/>
+              <w:cnfStyle w:val="000000000000" w:firstRow="0" w:lastRow="0" w:firstColumn="0" w:lastColumn="0" w:oddVBand="0" w:evenVBand="0" w:oddHBand="0" w:evenHBand="0" w:firstRowFirstColumn="0" w:firstRowLastColumn="0" w:lastRowFirstColumn="0" w:lastRowLastColumn="0"/>
+            </w:pPr>
+            <w:r>
+              <w:t>Las notificaciones deben ser automáticas. El sistema debe mantener un historial de todas las notificaciones enviadas</w:t>
+            </w:r>
+          </w:p>
+        </w:tc>
+      </w:tr>
+    </w:tbl>
+    <w:p>
+      <w:r>
+        <w:rPr>
+          <w:b/>
+          <w:bCs/>
+        </w:rPr>
+        <w:t>Nota.</w:t>
+      </w:r>
+      <w:r>
+        <w:t xml:space="preserve"> Elaboración propia</w:t>
+      </w:r>
+    </w:p>
     <w:sectPr>
       <w:pgSz w:w="11906" w:h="16838"/>
       <w:pgMar w:top="1417" w:right="1701" w:bottom="1417" w:left="1701" w:header="708" w:footer="708" w:gutter="0"/>
@@ -3581,6 +6253,163 @@
     </w:sectPr>
   </w:body>
 </w:document>
+</file>
+
+<file path=word/numbering.xml><?xml version="1.0" encoding="utf-8"?>
+<w:numbering xmlns:wpc="http://schemas.microsoft.com/office/word/2010/wordprocessingCanvas" xmlns:cx="http://schemas.microsoft.com/office/drawing/2014/chartex" xmlns:cx1="http://schemas.microsoft.com/office/drawing/2015/9/8/chartex" xmlns:cx2="http://schemas.microsoft.com/office/drawing/2015/10/21/chartex" xmlns:cx3="http://schemas.microsoft.com/office/drawing/2016/5/9/chartex" xmlns:cx4="http://schemas.microsoft.com/office/drawing/2016/5/10/chartex" xmlns:cx5="http://schemas.microsoft.com/office/drawing/2016/5/11/chartex" xmlns:cx6="http://schemas.microsoft.com/office/drawing/2016/5/12/chartex" xmlns:cx7="http://schemas.microsoft.com/office/drawing/2016/5/13/chartex" xmlns:cx8="http://schemas.microsoft.com/office/drawing/2016/5/14/chartex" xmlns:mc="http://schemas.openxmlformats.org/markup-compatibility/2006" xmlns:aink="http://schemas.microsoft.com/office/drawing/2016/ink" xmlns:am3d="http://schemas.microsoft.com/office/drawing/2017/model3d" xmlns:o="urn:schemas-microsoft-com:office:office" xmlns:oel="http://schemas.microsoft.com/office/2019/extlst" xmlns:r="http://schemas.openxmlformats.org/officeDocument/2006/relationships" xmlns:m="http://schemas.openxmlformats.org/officeDocument/2006/math" xmlns:v="urn:schemas-microsoft-com:vml" xmlns:wp14="http://schemas.microsoft.com/office/word/2010/wordprocessingDrawing" xmlns:wp="http://schemas.openxmlformats.org/drawingml/2006/wordprocessingDrawing" xmlns:w10="urn:schemas-microsoft-com:office:word" xmlns:w="http://schemas.openxmlformats.org/wordprocessingml/2006/main" xmlns:w14="http://schemas.microsoft.com/office/word/2010/wordml" xmlns:w15="http://schemas.microsoft.com/office/word/2012/wordml" xmlns:w16cex="http://schemas.microsoft.com/office/word/2018/wordml/cex" xmlns:w16cid="http://schemas.microsoft.com/office/word/2016/wordml/cid" xmlns:w16="http://schemas.microsoft.com/office/word/2018/wordml" xmlns:w16du="http://schemas.microsoft.com/office/word/2023/wordml/word16du" xmlns:w16sdtdh="http://schemas.microsoft.com/office/word/2020/wordml/sdtdatahash" xmlns:w16sdtfl="http://schemas.microsoft.com/office/word/2024/wordml/sdtformatlock" xmlns:w16se="http://schemas.microsoft.com/office/word/2015/wordml/symex" xmlns:wpg="http://schemas.microsoft.com/office/word/2010/wordprocessingGroup" xmlns:wpi="http://schemas.microsoft.com/office/word/2010/wordprocessingInk" xmlns:wne="http://schemas.microsoft.com/office/word/2006/wordml" xmlns:wps="http://schemas.microsoft.com/office/word/2010/wordprocessingShape" mc:Ignorable="w14 w15 w16se w16cid w16 w16cex w16sdtdh w16sdtfl w16du wp14">
+  <w:abstractNum w:abstractNumId="0" w15:restartNumberingAfterBreak="0">
+    <w:nsid w:val="2821362C"/>
+    <w:multiLevelType w:val="multilevel"/>
+    <w:tmpl w:val="EA847A18"/>
+    <w:lvl w:ilvl="0">
+      <w:start w:val="1"/>
+      <w:numFmt w:val="bullet"/>
+      <w:lvlText w:val=""/>
+      <w:lvlJc w:val="left"/>
+      <w:pPr>
+        <w:tabs>
+          <w:tab w:val="num" w:pos="720"/>
+        </w:tabs>
+        <w:ind w:left="720" w:hanging="360"/>
+      </w:pPr>
+      <w:rPr>
+        <w:rFonts w:ascii="Symbol" w:hAnsi="Symbol" w:hint="default"/>
+        <w:sz w:val="20"/>
+      </w:rPr>
+    </w:lvl>
+    <w:lvl w:ilvl="1" w:tentative="1">
+      <w:start w:val="1"/>
+      <w:numFmt w:val="bullet"/>
+      <w:lvlText w:val="o"/>
+      <w:lvlJc w:val="left"/>
+      <w:pPr>
+        <w:tabs>
+          <w:tab w:val="num" w:pos="1440"/>
+        </w:tabs>
+        <w:ind w:left="1440" w:hanging="360"/>
+      </w:pPr>
+      <w:rPr>
+        <w:rFonts w:ascii="Courier New" w:hAnsi="Courier New" w:hint="default"/>
+        <w:sz w:val="20"/>
+      </w:rPr>
+    </w:lvl>
+    <w:lvl w:ilvl="2" w:tentative="1">
+      <w:start w:val="1"/>
+      <w:numFmt w:val="bullet"/>
+      <w:lvlText w:val=""/>
+      <w:lvlJc w:val="left"/>
+      <w:pPr>
+        <w:tabs>
+          <w:tab w:val="num" w:pos="2160"/>
+        </w:tabs>
+        <w:ind w:left="2160" w:hanging="360"/>
+      </w:pPr>
+      <w:rPr>
+        <w:rFonts w:ascii="Wingdings" w:hAnsi="Wingdings" w:hint="default"/>
+        <w:sz w:val="20"/>
+      </w:rPr>
+    </w:lvl>
+    <w:lvl w:ilvl="3" w:tentative="1">
+      <w:start w:val="1"/>
+      <w:numFmt w:val="bullet"/>
+      <w:lvlText w:val=""/>
+      <w:lvlJc w:val="left"/>
+      <w:pPr>
+        <w:tabs>
+          <w:tab w:val="num" w:pos="2880"/>
+        </w:tabs>
+        <w:ind w:left="2880" w:hanging="360"/>
+      </w:pPr>
+      <w:rPr>
+        <w:rFonts w:ascii="Wingdings" w:hAnsi="Wingdings" w:hint="default"/>
+        <w:sz w:val="20"/>
+      </w:rPr>
+    </w:lvl>
+    <w:lvl w:ilvl="4" w:tentative="1">
+      <w:start w:val="1"/>
+      <w:numFmt w:val="bullet"/>
+      <w:lvlText w:val=""/>
+      <w:lvlJc w:val="left"/>
+      <w:pPr>
+        <w:tabs>
+          <w:tab w:val="num" w:pos="3600"/>
+        </w:tabs>
+        <w:ind w:left="3600" w:hanging="360"/>
+      </w:pPr>
+      <w:rPr>
+        <w:rFonts w:ascii="Wingdings" w:hAnsi="Wingdings" w:hint="default"/>
+        <w:sz w:val="20"/>
+      </w:rPr>
+    </w:lvl>
+    <w:lvl w:ilvl="5" w:tentative="1">
+      <w:start w:val="1"/>
+      <w:numFmt w:val="bullet"/>
+      <w:lvlText w:val=""/>
+      <w:lvlJc w:val="left"/>
+      <w:pPr>
+        <w:tabs>
+          <w:tab w:val="num" w:pos="4320"/>
+        </w:tabs>
+        <w:ind w:left="4320" w:hanging="360"/>
+      </w:pPr>
+      <w:rPr>
+        <w:rFonts w:ascii="Wingdings" w:hAnsi="Wingdings" w:hint="default"/>
+        <w:sz w:val="20"/>
+      </w:rPr>
+    </w:lvl>
+    <w:lvl w:ilvl="6" w:tentative="1">
+      <w:start w:val="1"/>
+      <w:numFmt w:val="bullet"/>
+      <w:lvlText w:val=""/>
+      <w:lvlJc w:val="left"/>
+      <w:pPr>
+        <w:tabs>
+          <w:tab w:val="num" w:pos="5040"/>
+        </w:tabs>
+        <w:ind w:left="5040" w:hanging="360"/>
+      </w:pPr>
+      <w:rPr>
+        <w:rFonts w:ascii="Wingdings" w:hAnsi="Wingdings" w:hint="default"/>
+        <w:sz w:val="20"/>
+      </w:rPr>
+    </w:lvl>
+    <w:lvl w:ilvl="7" w:tentative="1">
+      <w:start w:val="1"/>
+      <w:numFmt w:val="bullet"/>
+      <w:lvlText w:val=""/>
+      <w:lvlJc w:val="left"/>
+      <w:pPr>
+        <w:tabs>
+          <w:tab w:val="num" w:pos="5760"/>
+        </w:tabs>
+        <w:ind w:left="5760" w:hanging="360"/>
+      </w:pPr>
+      <w:rPr>
+        <w:rFonts w:ascii="Wingdings" w:hAnsi="Wingdings" w:hint="default"/>
+        <w:sz w:val="20"/>
+      </w:rPr>
+    </w:lvl>
+    <w:lvl w:ilvl="8" w:tentative="1">
+      <w:start w:val="1"/>
+      <w:numFmt w:val="bullet"/>
+      <w:lvlText w:val=""/>
+      <w:lvlJc w:val="left"/>
+      <w:pPr>
+        <w:tabs>
+          <w:tab w:val="num" w:pos="6480"/>
+        </w:tabs>
+        <w:ind w:left="6480" w:hanging="360"/>
+      </w:pPr>
+      <w:rPr>
+        <w:rFonts w:ascii="Wingdings" w:hAnsi="Wingdings" w:hint="default"/>
+        <w:sz w:val="20"/>
+      </w:rPr>
+    </w:lvl>
+  </w:abstractNum>
+  <w:num w:numId="1" w16cid:durableId="814564604">
+    <w:abstractNumId w:val="0"/>
+  </w:num>
+</w:numbering>
 </file>
 
 <file path=word/styles.xml><?xml version="1.0" encoding="utf-8"?>
@@ -3983,7 +6812,7 @@
   <w:style w:type="paragraph" w:default="1" w:styleId="Normal">
     <w:name w:val="Normal"/>
     <w:qFormat/>
-    <w:rsid w:val="00F03917"/>
+    <w:rsid w:val="000F0D4D"/>
     <w:pPr>
       <w:spacing w:after="0" w:line="360" w:lineRule="auto"/>
       <w:ind w:firstLine="720"/>
@@ -4191,7 +7020,6 @@
   <w:style w:type="character" w:default="1" w:styleId="Fuentedeprrafopredeter">
     <w:name w:val="Default Paragraph Font"/>
     <w:uiPriority w:val="1"/>
-    <w:semiHidden/>
     <w:unhideWhenUsed/>
   </w:style>
   <w:style w:type="table" w:default="1" w:styleId="Tablanormal">
@@ -4629,6 +7457,25 @@
       </w:tcPr>
     </w:tblStylePr>
   </w:style>
+  <w:style w:type="table" w:styleId="Tablaconcuadrcula">
+    <w:name w:val="Table Grid"/>
+    <w:basedOn w:val="Tablanormal"/>
+    <w:uiPriority w:val="39"/>
+    <w:rsid w:val="00AB6B8C"/>
+    <w:pPr>
+      <w:spacing w:after="0" w:line="240" w:lineRule="auto"/>
+    </w:pPr>
+    <w:tblPr>
+      <w:tblBorders>
+        <w:top w:val="single" w:sz="4" w:space="0" w:color="auto"/>
+        <w:left w:val="single" w:sz="4" w:space="0" w:color="auto"/>
+        <w:bottom w:val="single" w:sz="4" w:space="0" w:color="auto"/>
+        <w:right w:val="single" w:sz="4" w:space="0" w:color="auto"/>
+        <w:insideH w:val="single" w:sz="4" w:space="0" w:color="auto"/>
+        <w:insideV w:val="single" w:sz="4" w:space="0" w:color="auto"/>
+      </w:tblBorders>
+    </w:tblPr>
+  </w:style>
 </w:styles>
 </file>
 

</xml_diff>